<commit_message>
ajuste durante aula no word
</commit_message>
<xml_diff>
--- a/banco de dados/banco de dados Negra visao.docx
+++ b/banco de dados/banco de dados Negra visao.docx
@@ -1,6 +1,6 @@
 
 <file path=word/document.xml><?xml version="1.0" encoding="utf-8"?>
-<w:document xmlns:wpc="http://schemas.microsoft.com/office/word/2010/wordprocessingCanvas" xmlns:cx="http://schemas.microsoft.com/office/drawing/2014/chartex" xmlns:cx1="http://schemas.microsoft.com/office/drawing/2015/9/8/chartex" xmlns:cx2="http://schemas.microsoft.com/office/drawing/2015/10/21/chartex" xmlns:cx3="http://schemas.microsoft.com/office/drawing/2016/5/9/chartex" xmlns:cx4="http://schemas.microsoft.com/office/drawing/2016/5/10/chartex" xmlns:cx5="http://schemas.microsoft.com/office/drawing/2016/5/11/chartex" xmlns:cx6="http://schemas.microsoft.com/office/drawing/2016/5/12/chartex" xmlns:cx7="http://schemas.microsoft.com/office/drawing/2016/5/13/chartex" xmlns:cx8="http://schemas.microsoft.com/office/drawing/2016/5/14/chartex" xmlns:mc="http://schemas.openxmlformats.org/markup-compatibility/2006" xmlns:aink="http://schemas.microsoft.com/office/drawing/2016/ink" xmlns:am3d="http://schemas.microsoft.com/office/drawing/2017/model3d" xmlns:o="urn:schemas-microsoft-com:office:office" xmlns:oel="http://schemas.microsoft.com/office/2019/extlst" xmlns:r="http://schemas.openxmlformats.org/officeDocument/2006/relationships" xmlns:m="http://schemas.openxmlformats.org/officeDocument/2006/math" xmlns:v="urn:schemas-microsoft-com:vml" xmlns:wp14="http://schemas.microsoft.com/office/word/2010/wordprocessingDrawing" xmlns:wp="http://schemas.openxmlformats.org/drawingml/2006/wordprocessingDrawing" xmlns:w10="urn:schemas-microsoft-com:office:word" xmlns:w="http://schemas.openxmlformats.org/wordprocessingml/2006/main" xmlns:w14="http://schemas.microsoft.com/office/word/2010/wordml" xmlns:w15="http://schemas.microsoft.com/office/word/2012/wordml" xmlns:w16cex="http://schemas.microsoft.com/office/word/2018/wordml/cex" xmlns:w16cid="http://schemas.microsoft.com/office/word/2016/wordml/cid" xmlns:w16="http://schemas.microsoft.com/office/word/2018/wordml" xmlns:w16du="http://schemas.microsoft.com/office/word/2023/wordml/word16du" xmlns:w16sdtdh="http://schemas.microsoft.com/office/word/2020/wordml/sdtdatahash" xmlns:w16sdtfl="http://schemas.microsoft.com/office/word/2024/wordml/sdtformatlock" xmlns:w16se="http://schemas.microsoft.com/office/word/2015/wordml/symex" xmlns:wpg="http://schemas.microsoft.com/office/word/2010/wordprocessingGroup" xmlns:wpi="http://schemas.microsoft.com/office/word/2010/wordprocessingInk" xmlns:wne="http://schemas.microsoft.com/office/word/2006/wordml" xmlns:wps="http://schemas.microsoft.com/office/word/2010/wordprocessingShape" mc:Ignorable="w14 w15 w16se w16cid w16 w16cex w16sdtdh w16sdtfl w16du wp14">
+<w:document xmlns:wpc="http://schemas.microsoft.com/office/word/2010/wordprocessingCanvas" xmlns:cx="http://schemas.microsoft.com/office/drawing/2014/chartex" xmlns:cx1="http://schemas.microsoft.com/office/drawing/2015/9/8/chartex" xmlns:cx2="http://schemas.microsoft.com/office/drawing/2015/10/21/chartex" xmlns:cx3="http://schemas.microsoft.com/office/drawing/2016/5/9/chartex" xmlns:cx4="http://schemas.microsoft.com/office/drawing/2016/5/10/chartex" xmlns:cx5="http://schemas.microsoft.com/office/drawing/2016/5/11/chartex" xmlns:cx6="http://schemas.microsoft.com/office/drawing/2016/5/12/chartex" xmlns:cx7="http://schemas.microsoft.com/office/drawing/2016/5/13/chartex" xmlns:cx8="http://schemas.microsoft.com/office/drawing/2016/5/14/chartex" xmlns:mc="http://schemas.openxmlformats.org/markup-compatibility/2006" xmlns:aink="http://schemas.microsoft.com/office/drawing/2016/ink" xmlns:am3d="http://schemas.microsoft.com/office/drawing/2017/model3d" xmlns:o="urn:schemas-microsoft-com:office:office" xmlns:oel="http://schemas.microsoft.com/office/2019/extlst" xmlns:r="http://schemas.openxmlformats.org/officeDocument/2006/relationships" xmlns:m="http://schemas.openxmlformats.org/officeDocument/2006/math" xmlns:v="urn:schemas-microsoft-com:vml" xmlns:wp14="http://schemas.microsoft.com/office/word/2010/wordprocessingDrawing" xmlns:wp="http://schemas.openxmlformats.org/drawingml/2006/wordprocessingDrawing" xmlns:w10="urn:schemas-microsoft-com:office:word" xmlns:w="http://schemas.openxmlformats.org/wordprocessingml/2006/main" xmlns:w14="http://schemas.microsoft.com/office/word/2010/wordml" xmlns:w15="http://schemas.microsoft.com/office/word/2012/wordml" xmlns:w16cex="http://schemas.microsoft.com/office/word/2018/wordml/cex" xmlns:w16cid="http://schemas.microsoft.com/office/word/2016/wordml/cid" xmlns:w16="http://schemas.microsoft.com/office/word/2018/wordml" xmlns:w16sdtdh="http://schemas.microsoft.com/office/word/2020/wordml/sdtdatahash" xmlns:w16se="http://schemas.microsoft.com/office/word/2015/wordml/symex" xmlns:wpg="http://schemas.microsoft.com/office/word/2010/wordprocessingGroup" xmlns:wpi="http://schemas.microsoft.com/office/word/2010/wordprocessingInk" xmlns:wne="http://schemas.microsoft.com/office/word/2006/wordml" xmlns:wps="http://schemas.microsoft.com/office/word/2010/wordprocessingShape" mc:Ignorable="w14 w15 w16se w16cid w16 w16cex w16sdtdh wp14">
   <w:body>
     <w:p>
       <w:pPr>
@@ -209,13 +209,8 @@
           <w:numId w:val="10"/>
         </w:numPr>
       </w:pPr>
-      <w:proofErr w:type="spellStart"/>
-      <w:r>
-        <w:t>id_pessoa</w:t>
-      </w:r>
-      <w:proofErr w:type="spellEnd"/>
-      <w:r>
-        <w:t xml:space="preserve"> - </w:t>
+      <w:r>
+        <w:t xml:space="preserve">id_pessoa - </w:t>
       </w:r>
       <w:r>
         <w:rPr>
@@ -248,16 +243,11 @@
           <w:numId w:val="10"/>
         </w:numPr>
       </w:pPr>
-      <w:proofErr w:type="spellStart"/>
       <w:r>
         <w:t>nr_</w:t>
       </w:r>
       <w:r>
-        <w:t>cpf</w:t>
-      </w:r>
-      <w:proofErr w:type="spellEnd"/>
-      <w:r>
-        <w:t xml:space="preserve"> - </w:t>
+        <w:t xml:space="preserve">cpf - </w:t>
       </w:r>
       <w:r>
         <w:rPr>
@@ -278,16 +268,11 @@
           <w:numId w:val="10"/>
         </w:numPr>
       </w:pPr>
-      <w:proofErr w:type="spellStart"/>
       <w:r>
         <w:t>dt_</w:t>
       </w:r>
       <w:r>
-        <w:t>nascimento</w:t>
-      </w:r>
-      <w:proofErr w:type="spellEnd"/>
-      <w:r>
-        <w:t xml:space="preserve"> - Data de nascimento da pessoa. Não pode estar no futuro.</w:t>
+        <w:t>nascimento - Data de nascimento da pessoa. Não pode estar no futuro.</w:t>
       </w:r>
     </w:p>
     <w:p>
@@ -298,16 +283,11 @@
           <w:numId w:val="10"/>
         </w:numPr>
       </w:pPr>
-      <w:proofErr w:type="spellStart"/>
       <w:r>
         <w:t>ds_</w:t>
       </w:r>
       <w:r>
-        <w:t>email</w:t>
-      </w:r>
-      <w:proofErr w:type="spellEnd"/>
-      <w:r>
-        <w:t xml:space="preserve"> - E-mail para contato. É opcional, mas deve possuir formato válido quando informado.</w:t>
+        <w:t>email - E-mail para contato. É opcional, mas deve possuir formato válido quando informado.</w:t>
       </w:r>
     </w:p>
     <w:p>
@@ -319,6 +299,9 @@
         </w:numPr>
       </w:pPr>
       <w:r>
+        <w:t>nr_</w:t>
+      </w:r>
+      <w:r>
         <w:t>telefone - Telefone para contato. É opcional e, quando informado, deve possuir DDD e 10 ou 11 dígitos.</w:t>
       </w:r>
     </w:p>
@@ -330,11 +313,12 @@
           <w:numId w:val="10"/>
         </w:numPr>
       </w:pPr>
-      <w:proofErr w:type="spellStart"/>
-      <w:r>
-        <w:t>situacao</w:t>
-      </w:r>
-      <w:proofErr w:type="spellEnd"/>
+      <w:r>
+        <w:t>s</w:t>
+      </w:r>
+      <w:r>
+        <w:t>t_pessoa</w:t>
+      </w:r>
       <w:r>
         <w:t xml:space="preserve"> - Indica a situação global da pessoa no sistema, permitindo representar cadastro ativo ou inativo.</w:t>
       </w:r>
@@ -362,13 +346,8 @@
           <w:numId w:val="13"/>
         </w:numPr>
       </w:pPr>
-      <w:proofErr w:type="spellStart"/>
-      <w:r>
-        <w:t>id_endereco</w:t>
-      </w:r>
-      <w:proofErr w:type="spellEnd"/>
-      <w:r>
-        <w:t xml:space="preserve"> - </w:t>
+      <w:r>
+        <w:t xml:space="preserve">id_endereco - </w:t>
       </w:r>
       <w:r>
         <w:rPr>
@@ -389,13 +368,8 @@
           <w:numId w:val="13"/>
         </w:numPr>
       </w:pPr>
-      <w:proofErr w:type="spellStart"/>
-      <w:r>
-        <w:t>id_pessoa</w:t>
-      </w:r>
-      <w:proofErr w:type="spellEnd"/>
-      <w:r>
-        <w:t xml:space="preserve"> - </w:t>
+      <w:r>
+        <w:t xml:space="preserve">id_pessoa - </w:t>
       </w:r>
       <w:r>
         <w:rPr>
@@ -417,6 +391,9 @@
         </w:numPr>
       </w:pPr>
       <w:r>
+        <w:t>nr_</w:t>
+      </w:r>
+      <w:r>
         <w:t>cep - CEP correspondente ao endereço da pessoa. Deve possuir exatamente oito dígitos.</w:t>
       </w:r>
     </w:p>
@@ -429,6 +406,9 @@
         </w:numPr>
       </w:pPr>
       <w:r>
+        <w:t>ds_</w:t>
+      </w:r>
+      <w:r>
         <w:t>logradouro - Nome do logradouro do endereço. Pode ser obtido por meio do serviço de endereços ou informado manualmente.</w:t>
       </w:r>
     </w:p>
@@ -440,11 +420,9 @@
           <w:numId w:val="13"/>
         </w:numPr>
       </w:pPr>
-      <w:proofErr w:type="spellStart"/>
-      <w:r>
-        <w:t>numero</w:t>
-      </w:r>
-      <w:proofErr w:type="spellEnd"/>
+      <w:r>
+        <w:t>nr_imovel</w:t>
+      </w:r>
       <w:r>
         <w:t xml:space="preserve"> - Número do imóvel. Pode receber o valor S/N quando o imóvel não possuir número.</w:t>
       </w:r>
@@ -458,6 +436,9 @@
         </w:numPr>
       </w:pPr>
       <w:r>
+        <w:t>ds_</w:t>
+      </w:r>
+      <w:r>
         <w:t>complemento - Informação complementar do endereço. É opcional.</w:t>
       </w:r>
     </w:p>
@@ -470,6 +451,9 @@
         </w:numPr>
       </w:pPr>
       <w:r>
+        <w:t>ds_</w:t>
+      </w:r>
+      <w:r>
         <w:t>bairro - Bairro correspondente ao endereço da pessoa.</w:t>
       </w:r>
     </w:p>
@@ -481,13 +465,11 @@
           <w:numId w:val="13"/>
         </w:numPr>
       </w:pPr>
-      <w:proofErr w:type="spellStart"/>
-      <w:r>
-        <w:t>municipio</w:t>
-      </w:r>
-      <w:proofErr w:type="spellEnd"/>
-      <w:r>
-        <w:t xml:space="preserve"> - Município correspondente ao endereço da pessoa.</w:t>
+      <w:r>
+        <w:t>ds_</w:t>
+      </w:r>
+      <w:r>
+        <w:t>municipio - Município correspondente ao endereço da pessoa.</w:t>
       </w:r>
     </w:p>
     <w:p>
@@ -499,6 +481,9 @@
         </w:numPr>
       </w:pPr>
       <w:r>
+        <w:t>sg_</w:t>
+      </w:r>
+      <w:r>
         <w:t>uf - Unidade Federativa correspondente ao endereço da pessoa.</w:t>
       </w:r>
     </w:p>
@@ -525,13 +510,8 @@
           <w:numId w:val="15"/>
         </w:numPr>
       </w:pPr>
-      <w:proofErr w:type="spellStart"/>
-      <w:r>
-        <w:t>id_papel</w:t>
-      </w:r>
-      <w:proofErr w:type="spellEnd"/>
-      <w:r>
-        <w:t xml:space="preserve"> - </w:t>
+      <w:r>
+        <w:t xml:space="preserve">id_papel - </w:t>
       </w:r>
       <w:r>
         <w:rPr>
@@ -552,13 +532,11 @@
           <w:numId w:val="15"/>
         </w:numPr>
       </w:pPr>
-      <w:proofErr w:type="spellStart"/>
-      <w:r>
-        <w:t>nome_papel</w:t>
-      </w:r>
-      <w:proofErr w:type="spellEnd"/>
-      <w:r>
-        <w:t xml:space="preserve"> - Nome do papel que uma pessoa pode exercer no sistema, como PARTICIPANTE, RESPONSAVEL, COLABORADOR ou ADMINISTRADOR.</w:t>
+      <w:r>
+        <w:t>nm</w:t>
+      </w:r>
+      <w:r>
+        <w:t>_papel - Nome do papel que uma pessoa pode exercer no sistema, como PARTICIPANTE, RESPONSAVEL, COLABORADOR ou ADMINISTRADOR.</w:t>
       </w:r>
     </w:p>
     <w:p>
@@ -584,13 +562,8 @@
           <w:numId w:val="17"/>
         </w:numPr>
       </w:pPr>
-      <w:proofErr w:type="spellStart"/>
-      <w:r>
-        <w:t>id_pessoa</w:t>
-      </w:r>
-      <w:proofErr w:type="spellEnd"/>
-      <w:r>
-        <w:t xml:space="preserve"> - </w:t>
+      <w:r>
+        <w:t xml:space="preserve">id_pessoa - </w:t>
       </w:r>
       <w:r>
         <w:rPr>
@@ -611,14 +584,9 @@
           <w:numId w:val="17"/>
         </w:numPr>
       </w:pPr>
-      <w:proofErr w:type="spellStart"/>
       <w:r>
         <w:lastRenderedPageBreak/>
-        <w:t>id_papel</w:t>
-      </w:r>
-      <w:proofErr w:type="spellEnd"/>
-      <w:r>
-        <w:t xml:space="preserve"> - </w:t>
+        <w:t xml:space="preserve">id_papel - </w:t>
       </w:r>
       <w:r>
         <w:rPr>
@@ -633,23 +601,7 @@
     </w:p>
     <w:p>
       <w:r>
-        <w:t xml:space="preserve">A combinação entre </w:t>
-      </w:r>
-      <w:proofErr w:type="spellStart"/>
-      <w:r>
-        <w:t>id_pessoa</w:t>
-      </w:r>
-      <w:proofErr w:type="spellEnd"/>
-      <w:r>
-        <w:t xml:space="preserve"> e </w:t>
-      </w:r>
-      <w:proofErr w:type="spellStart"/>
-      <w:r>
-        <w:t>id_papel</w:t>
-      </w:r>
-      <w:proofErr w:type="spellEnd"/>
-      <w:r>
-        <w:t xml:space="preserve"> identifica unicamente cada atribuição de papel e permite que uma mesma pessoa possua vários papéis simultaneamente.</w:t>
+        <w:t>A combinação entre id_pessoa e id_papel identifica unicamente cada atribuição de papel e permite que uma mesma pessoa possua vários papéis simultaneamente.</w:t>
       </w:r>
     </w:p>
     <w:p>
@@ -675,13 +627,8 @@
           <w:numId w:val="19"/>
         </w:numPr>
       </w:pPr>
-      <w:proofErr w:type="spellStart"/>
-      <w:r>
-        <w:t>id_usuario</w:t>
-      </w:r>
-      <w:proofErr w:type="spellEnd"/>
-      <w:r>
-        <w:t xml:space="preserve"> - </w:t>
+      <w:r>
+        <w:t xml:space="preserve">id_usuario - </w:t>
       </w:r>
       <w:r>
         <w:rPr>
@@ -702,13 +649,8 @@
           <w:numId w:val="19"/>
         </w:numPr>
       </w:pPr>
-      <w:proofErr w:type="spellStart"/>
-      <w:r>
-        <w:t>id_pessoa</w:t>
-      </w:r>
-      <w:proofErr w:type="spellEnd"/>
-      <w:r>
-        <w:t xml:space="preserve"> - </w:t>
+      <w:r>
+        <w:t xml:space="preserve">id_pessoa - </w:t>
       </w:r>
       <w:r>
         <w:rPr>
@@ -730,6 +672,9 @@
         </w:numPr>
       </w:pPr>
       <w:r>
+        <w:t>nm_</w:t>
+      </w:r>
+      <w:r>
         <w:t xml:space="preserve">login - </w:t>
       </w:r>
       <w:r>
@@ -752,6 +697,9 @@
         </w:numPr>
       </w:pPr>
       <w:r>
+        <w:t>nm_</w:t>
+      </w:r>
+      <w:r>
         <w:t>senha - Senha utilizada pelo usuário para autenticação no painel interno.</w:t>
       </w:r>
     </w:p>
@@ -763,13 +711,11 @@
           <w:numId w:val="19"/>
         </w:numPr>
       </w:pPr>
-      <w:proofErr w:type="spellStart"/>
-      <w:r>
-        <w:t>situacao_acesso</w:t>
-      </w:r>
-      <w:proofErr w:type="spellEnd"/>
-      <w:r>
-        <w:t xml:space="preserve"> - Indica se o acesso do usuário interno está ativo ou inativo. A inativação do acesso não impede que a pessoa participe de eventos.</w:t>
+      <w:r>
+        <w:t>st_</w:t>
+      </w:r>
+      <w:r>
+        <w:t>situacao_acesso - Indica se o acesso do usuário interno está ativo ou inativo. A inativação do acesso não impede que a pessoa participe de eventos.</w:t>
       </w:r>
     </w:p>
     <w:p>
@@ -795,13 +741,8 @@
           <w:numId w:val="21"/>
         </w:numPr>
       </w:pPr>
-      <w:proofErr w:type="spellStart"/>
-      <w:r>
-        <w:t>id_responsavel</w:t>
-      </w:r>
-      <w:proofErr w:type="spellEnd"/>
-      <w:r>
-        <w:t xml:space="preserve"> - </w:t>
+      <w:r>
+        <w:t xml:space="preserve">id_responsavel - </w:t>
       </w:r>
       <w:r>
         <w:rPr>
@@ -822,13 +763,8 @@
           <w:numId w:val="21"/>
         </w:numPr>
       </w:pPr>
-      <w:proofErr w:type="spellStart"/>
-      <w:r>
-        <w:t>id_pessoa</w:t>
-      </w:r>
-      <w:proofErr w:type="spellEnd"/>
-      <w:r>
-        <w:t xml:space="preserve"> - </w:t>
+      <w:r>
+        <w:t xml:space="preserve">id_pessoa - </w:t>
       </w:r>
       <w:r>
         <w:rPr>
@@ -849,11 +785,12 @@
           <w:numId w:val="21"/>
         </w:numPr>
       </w:pPr>
-      <w:proofErr w:type="spellStart"/>
-      <w:r>
-        <w:t>descricao_atuacao</w:t>
-      </w:r>
-      <w:proofErr w:type="spellEnd"/>
+      <w:r>
+        <w:t>ds_</w:t>
+      </w:r>
+      <w:r>
+        <w:t>responsavel</w:t>
+      </w:r>
       <w:r>
         <w:t xml:space="preserve"> - Descrição opcional referente à atuação da pessoa como responsável.</w:t>
       </w:r>
@@ -881,13 +818,8 @@
           <w:numId w:val="23"/>
         </w:numPr>
       </w:pPr>
-      <w:proofErr w:type="spellStart"/>
-      <w:r>
-        <w:t>id_evento</w:t>
-      </w:r>
-      <w:proofErr w:type="spellEnd"/>
-      <w:r>
-        <w:t xml:space="preserve"> - </w:t>
+      <w:r>
+        <w:t xml:space="preserve">id_evento - </w:t>
       </w:r>
       <w:r>
         <w:rPr>
@@ -908,13 +840,11 @@
           <w:numId w:val="23"/>
         </w:numPr>
       </w:pPr>
-      <w:proofErr w:type="spellStart"/>
-      <w:r>
-        <w:t>titulo</w:t>
-      </w:r>
-      <w:proofErr w:type="spellEnd"/>
-      <w:r>
-        <w:t xml:space="preserve"> - Título ou nome utilizado para identificar o evento.</w:t>
+      <w:r>
+        <w:t>ds_</w:t>
+      </w:r>
+      <w:r>
+        <w:t>titulo - Título ou nome utilizado para identificar o evento.</w:t>
       </w:r>
     </w:p>
     <w:p>
@@ -925,11 +855,9 @@
           <w:numId w:val="23"/>
         </w:numPr>
       </w:pPr>
-      <w:proofErr w:type="spellStart"/>
-      <w:r>
-        <w:t>descricao</w:t>
-      </w:r>
-      <w:proofErr w:type="spellEnd"/>
+      <w:r>
+        <w:t>ds_evento</w:t>
+      </w:r>
       <w:r>
         <w:t xml:space="preserve"> - Descrição da atividade oferecida no evento.</w:t>
       </w:r>
@@ -942,13 +870,14 @@
           <w:numId w:val="23"/>
         </w:numPr>
       </w:pPr>
-      <w:proofErr w:type="spellStart"/>
-      <w:r>
-        <w:t>tipo_evento</w:t>
-      </w:r>
-      <w:proofErr w:type="spellEnd"/>
-      <w:r>
-        <w:t xml:space="preserve"> - Tipo do evento, podendo ser curso, oficina ou palestra.</w:t>
+      <w:r>
+        <w:t>t</w:t>
+      </w:r>
+      <w:r>
+        <w:t>p</w:t>
+      </w:r>
+      <w:r>
+        <w:t>_evento - Tipo do evento, podendo ser curso, oficina ou palestra.</w:t>
       </w:r>
     </w:p>
     <w:p>
@@ -960,6 +889,9 @@
         </w:numPr>
       </w:pPr>
       <w:r>
+        <w:t>ds_</w:t>
+      </w:r>
+      <w:r>
         <w:t>local - Local onde o evento será realizado.</w:t>
       </w:r>
     </w:p>
@@ -971,13 +903,11 @@
           <w:numId w:val="23"/>
         </w:numPr>
       </w:pPr>
-      <w:proofErr w:type="spellStart"/>
-      <w:r>
-        <w:t>classificacao</w:t>
-      </w:r>
-      <w:proofErr w:type="spellEnd"/>
-      <w:r>
-        <w:t xml:space="preserve"> - Indica se o evento é UNICO ou RECORRENTE.</w:t>
+      <w:r>
+        <w:t>st_</w:t>
+      </w:r>
+      <w:r>
+        <w:t>classificacao - Indica se o evento é UNICO ou RECORRENTE.</w:t>
       </w:r>
     </w:p>
     <w:p>
@@ -988,13 +918,11 @@
           <w:numId w:val="23"/>
         </w:numPr>
       </w:pPr>
-      <w:proofErr w:type="spellStart"/>
-      <w:r>
-        <w:t>frequencia</w:t>
-      </w:r>
-      <w:proofErr w:type="spellEnd"/>
-      <w:r>
-        <w:t xml:space="preserve"> - Define a frequência de realização de um evento recorrente, podendo ser diária, semanal, quinzenal ou mensal. Não se aplica aos eventos únicos.</w:t>
+      <w:r>
+        <w:t>st_</w:t>
+      </w:r>
+      <w:r>
+        <w:t>frequencia - Define a frequência de realização de um evento recorrente, podendo ser diária, semanal, quinzenal ou mensal. Não se aplica aos eventos únicos.</w:t>
       </w:r>
     </w:p>
     <w:p>
@@ -1005,13 +933,11 @@
           <w:numId w:val="23"/>
         </w:numPr>
       </w:pPr>
-      <w:proofErr w:type="spellStart"/>
-      <w:r>
-        <w:t>modalidade_duracao</w:t>
-      </w:r>
-      <w:proofErr w:type="spellEnd"/>
-      <w:r>
-        <w:t xml:space="preserve"> - Define o critério utilizado para determinar o encerramento de uma série recorrente: quantidade de ocorrências, data final ou SEM_PREVISAO_DE_FIM.</w:t>
+      <w:r>
+        <w:t>ds_</w:t>
+      </w:r>
+      <w:r>
+        <w:t>modalidade_duracao - Define o critério utilizado para determinar o encerramento de uma série recorrente: quantidade de ocorrências, data final ou SEM_PREVISAO_DE_FIM.</w:t>
       </w:r>
     </w:p>
     <w:p>
@@ -1022,13 +948,11 @@
           <w:numId w:val="23"/>
         </w:numPr>
       </w:pPr>
-      <w:proofErr w:type="spellStart"/>
-      <w:r>
-        <w:t>quantidade_total_ocorrencias</w:t>
-      </w:r>
-      <w:proofErr w:type="spellEnd"/>
-      <w:r>
-        <w:t xml:space="preserve"> - Quantidade total de ocorrências previstas quando o evento recorrente utilizar quantidade como critério de duração.</w:t>
+      <w:r>
+        <w:t>nr_</w:t>
+      </w:r>
+      <w:r>
+        <w:t>quantidade_total_ocorrencias - Quantidade total de ocorrências previstas quando o evento recorrente utilizar quantidade como critério de duração.</w:t>
       </w:r>
     </w:p>
     <w:p>
@@ -1039,13 +963,15 @@
           <w:numId w:val="23"/>
         </w:numPr>
       </w:pPr>
-      <w:proofErr w:type="spellStart"/>
-      <w:r>
-        <w:t>data_final</w:t>
-      </w:r>
-      <w:proofErr w:type="spellEnd"/>
-      <w:r>
-        <w:t xml:space="preserve"> - Data que determina o encerramento da série quando o evento recorrente utilizar uma data final como critério de duração.</w:t>
+      <w:r>
+        <w:lastRenderedPageBreak/>
+        <w:t>d</w:t>
+      </w:r>
+      <w:r>
+        <w:t>t</w:t>
+      </w:r>
+      <w:r>
+        <w:t>_final - Data que determina o encerramento da série quando o evento recorrente utilizar uma data final como critério de duração.</w:t>
       </w:r>
     </w:p>
     <w:p>
@@ -1057,7 +983,9 @@
         </w:numPr>
       </w:pPr>
       <w:r>
-        <w:lastRenderedPageBreak/>
+        <w:t>nr_</w:t>
+      </w:r>
+      <w:r>
         <w:t>capacidade - Quantidade máxima de participantes permitida no evento. A mesma capacidade é aplicada a todas as suas ocorrências.</w:t>
       </w:r>
     </w:p>
@@ -1069,13 +997,14 @@
           <w:numId w:val="23"/>
         </w:numPr>
       </w:pPr>
-      <w:proofErr w:type="spellStart"/>
-      <w:r>
-        <w:t>data_hora_abertura_inscricao</w:t>
-      </w:r>
-      <w:proofErr w:type="spellEnd"/>
-      <w:r>
-        <w:t xml:space="preserve"> - Data e hora a partir das quais as inscrições podem ser realizadas.</w:t>
+      <w:r>
+        <w:t>d</w:t>
+      </w:r>
+      <w:r>
+        <w:t>t</w:t>
+      </w:r>
+      <w:r>
+        <w:t>_hora_abertura_inscricao - Data e hora a partir das quais as inscrições podem ser realizadas.</w:t>
       </w:r>
     </w:p>
     <w:p>
@@ -1086,13 +1015,14 @@
           <w:numId w:val="23"/>
         </w:numPr>
       </w:pPr>
-      <w:proofErr w:type="spellStart"/>
-      <w:r>
-        <w:t>data_hora_encerramento_inscricao</w:t>
-      </w:r>
-      <w:proofErr w:type="spellEnd"/>
-      <w:r>
-        <w:t xml:space="preserve"> - Data e hora de encerramento das inscrições. Pode não ser informada nos eventos sem previsão de fim.</w:t>
+      <w:r>
+        <w:t>d</w:t>
+      </w:r>
+      <w:r>
+        <w:t>t</w:t>
+      </w:r>
+      <w:r>
+        <w:t>_hora_encerramento_inscricao - Data e hora de encerramento das inscrições. Pode não ser informada nos eventos sem previsão de fim.</w:t>
       </w:r>
     </w:p>
     <w:p>
@@ -1103,13 +1033,11 @@
           <w:numId w:val="23"/>
         </w:numPr>
       </w:pPr>
-      <w:proofErr w:type="spellStart"/>
-      <w:r>
-        <w:t>limite_faltas_consecutivas</w:t>
-      </w:r>
-      <w:proofErr w:type="spellEnd"/>
-      <w:r>
-        <w:t xml:space="preserve"> - Quantidade máxima de faltas consecutivas permitida em eventos recorrentes sem previsão de fim.</w:t>
+      <w:r>
+        <w:t>nr_</w:t>
+      </w:r>
+      <w:r>
+        <w:t>limite_faltas_consecutivas - Quantidade máxima de faltas consecutivas permitida em eventos recorrentes sem previsão de fim.</w:t>
       </w:r>
     </w:p>
     <w:p>
@@ -1121,6 +1049,9 @@
         </w:numPr>
       </w:pPr>
       <w:r>
+        <w:t>st_</w:t>
+      </w:r>
+      <w:r>
         <w:t>estado - Representa o estado atual do evento, como PROGRAMADO, REALIZADO ou CANCELADO.</w:t>
       </w:r>
     </w:p>
@@ -1133,6 +1064,9 @@
         </w:numPr>
       </w:pPr>
       <w:r>
+        <w:t>st_</w:t>
+      </w:r>
+      <w:r>
         <w:t>visibilidade - Indica se o evento está OCULTO ou PUBLICADO na área pública.</w:t>
       </w:r>
     </w:p>
@@ -1144,13 +1078,11 @@
           <w:numId w:val="23"/>
         </w:numPr>
       </w:pPr>
-      <w:proofErr w:type="spellStart"/>
-      <w:r>
-        <w:t>motivo_cancelamento</w:t>
-      </w:r>
-      <w:proofErr w:type="spellEnd"/>
-      <w:r>
-        <w:t xml:space="preserve"> - Motivo informado no cancelamento do evento. É obrigatório quando o evento é cancelado.</w:t>
+      <w:r>
+        <w:t>ds_</w:t>
+      </w:r>
+      <w:r>
+        <w:t>motivo_cancelamento - Motivo informado no cancelamento do evento. É obrigatório quando o evento é cancelado.</w:t>
       </w:r>
     </w:p>
     <w:p>
@@ -1176,13 +1108,8 @@
           <w:numId w:val="25"/>
         </w:numPr>
       </w:pPr>
-      <w:proofErr w:type="spellStart"/>
-      <w:r>
-        <w:t>id_evento</w:t>
-      </w:r>
-      <w:proofErr w:type="spellEnd"/>
-      <w:r>
-        <w:t xml:space="preserve"> - </w:t>
+      <w:r>
+        <w:t xml:space="preserve">id_evento - </w:t>
       </w:r>
       <w:r>
         <w:rPr>
@@ -1203,13 +1130,8 @@
           <w:numId w:val="25"/>
         </w:numPr>
       </w:pPr>
-      <w:proofErr w:type="spellStart"/>
-      <w:r>
-        <w:t>id_responsavel</w:t>
-      </w:r>
-      <w:proofErr w:type="spellEnd"/>
-      <w:r>
-        <w:t xml:space="preserve"> - </w:t>
+      <w:r>
+        <w:t xml:space="preserve">id_responsavel - </w:t>
       </w:r>
       <w:r>
         <w:rPr>
@@ -1224,23 +1146,7 @@
     </w:p>
     <w:p>
       <w:r>
-        <w:t xml:space="preserve">A combinação entre </w:t>
-      </w:r>
-      <w:proofErr w:type="spellStart"/>
-      <w:r>
-        <w:t>id_evento</w:t>
-      </w:r>
-      <w:proofErr w:type="spellEnd"/>
-      <w:r>
-        <w:t xml:space="preserve"> e </w:t>
-      </w:r>
-      <w:proofErr w:type="spellStart"/>
-      <w:r>
-        <w:t>id_responsavel</w:t>
-      </w:r>
-      <w:proofErr w:type="spellEnd"/>
-      <w:r>
-        <w:t xml:space="preserve"> identifica unicamente cada vínculo entre evento e responsável. Cada evento deve possuir pelo menos um responsável.</w:t>
+        <w:t>A combinação entre id_evento e id_responsavel identifica unicamente cada vínculo entre evento e responsável. Cada evento deve possuir pelo menos um responsável.</w:t>
       </w:r>
     </w:p>
     <w:p>
@@ -1266,13 +1172,8 @@
           <w:numId w:val="27"/>
         </w:numPr>
       </w:pPr>
-      <w:proofErr w:type="spellStart"/>
-      <w:r>
-        <w:t>id_ocorrencia</w:t>
-      </w:r>
-      <w:proofErr w:type="spellEnd"/>
-      <w:r>
-        <w:t xml:space="preserve"> - </w:t>
+      <w:r>
+        <w:t xml:space="preserve">id_ocorrencia - </w:t>
       </w:r>
       <w:r>
         <w:rPr>
@@ -1293,13 +1194,8 @@
           <w:numId w:val="27"/>
         </w:numPr>
       </w:pPr>
-      <w:proofErr w:type="spellStart"/>
-      <w:r>
-        <w:t>id_evento</w:t>
-      </w:r>
-      <w:proofErr w:type="spellEnd"/>
-      <w:r>
-        <w:t xml:space="preserve"> - </w:t>
+      <w:r>
+        <w:t xml:space="preserve">id_evento - </w:t>
       </w:r>
       <w:r>
         <w:rPr>
@@ -1320,13 +1216,14 @@
           <w:numId w:val="27"/>
         </w:numPr>
       </w:pPr>
-      <w:proofErr w:type="spellStart"/>
-      <w:r>
-        <w:t>data_hora_inicio</w:t>
-      </w:r>
-      <w:proofErr w:type="spellEnd"/>
-      <w:r>
-        <w:t xml:space="preserve"> - Data e hora em que a ocorrência do evento começa.</w:t>
+      <w:r>
+        <w:t>d</w:t>
+      </w:r>
+      <w:r>
+        <w:t>t</w:t>
+      </w:r>
+      <w:r>
+        <w:t>_hora_inicio - Data e hora em que a ocorrência do evento começa.</w:t>
       </w:r>
     </w:p>
     <w:p>
@@ -1337,13 +1234,14 @@
           <w:numId w:val="27"/>
         </w:numPr>
       </w:pPr>
-      <w:proofErr w:type="spellStart"/>
-      <w:r>
-        <w:t>data_hora_fim</w:t>
-      </w:r>
-      <w:proofErr w:type="spellEnd"/>
-      <w:r>
-        <w:t xml:space="preserve"> - Data e hora em que a ocorrência termina. Deve ser posterior ao início.</w:t>
+      <w:r>
+        <w:t>d</w:t>
+      </w:r>
+      <w:r>
+        <w:t>t</w:t>
+      </w:r>
+      <w:r>
+        <w:t>_hora_fim - Data e hora em que a ocorrência termina. Deve ser posterior ao início.</w:t>
       </w:r>
     </w:p>
     <w:p>
@@ -1355,6 +1253,9 @@
         </w:numPr>
       </w:pPr>
       <w:r>
+        <w:t>st_</w:t>
+      </w:r>
+      <w:r>
         <w:t>cancelada - Indica se a ocorrência foi cancelada. O cancelamento de um evento pode afetar somente suas ocorrências futuras.</w:t>
       </w:r>
     </w:p>
@@ -1366,13 +1267,11 @@
           <w:numId w:val="27"/>
         </w:numPr>
       </w:pPr>
-      <w:proofErr w:type="spellStart"/>
-      <w:r>
-        <w:t>lista_presenca_finalizada</w:t>
-      </w:r>
-      <w:proofErr w:type="spellEnd"/>
-      <w:r>
-        <w:t xml:space="preserve"> - Indica se a lista de presença da ocorrência já foi finalizada. Cada lista pode ser finalizada apenas uma vez.</w:t>
+      <w:r>
+        <w:t>st_</w:t>
+      </w:r>
+      <w:r>
+        <w:t>lista_presenca_finalizada - Indica se a lista de presença da ocorrência já foi finalizada. Cada lista pode ser finalizada apenas uma vez.</w:t>
       </w:r>
     </w:p>
     <w:p>
@@ -1398,13 +1297,8 @@
           <w:numId w:val="29"/>
         </w:numPr>
       </w:pPr>
-      <w:proofErr w:type="spellStart"/>
-      <w:r>
-        <w:t>id_inscricao</w:t>
-      </w:r>
-      <w:proofErr w:type="spellEnd"/>
-      <w:r>
-        <w:t xml:space="preserve"> - </w:t>
+      <w:r>
+        <w:t xml:space="preserve">id_inscricao - </w:t>
       </w:r>
       <w:r>
         <w:rPr>
@@ -1425,13 +1319,8 @@
           <w:numId w:val="29"/>
         </w:numPr>
       </w:pPr>
-      <w:proofErr w:type="spellStart"/>
-      <w:r>
-        <w:t>id_pessoa</w:t>
-      </w:r>
-      <w:proofErr w:type="spellEnd"/>
-      <w:r>
-        <w:t xml:space="preserve"> - </w:t>
+      <w:r>
+        <w:t xml:space="preserve">id_pessoa - </w:t>
       </w:r>
       <w:r>
         <w:rPr>
@@ -1452,13 +1341,9 @@
           <w:numId w:val="29"/>
         </w:numPr>
       </w:pPr>
-      <w:proofErr w:type="spellStart"/>
-      <w:r>
-        <w:t>id_evento</w:t>
-      </w:r>
-      <w:proofErr w:type="spellEnd"/>
-      <w:r>
-        <w:t xml:space="preserve"> - </w:t>
+      <w:r>
+        <w:lastRenderedPageBreak/>
+        <w:t xml:space="preserve">id_evento - </w:t>
       </w:r>
       <w:r>
         <w:rPr>
@@ -1479,14 +1364,14 @@
           <w:numId w:val="29"/>
         </w:numPr>
       </w:pPr>
-      <w:proofErr w:type="spellStart"/>
-      <w:r>
-        <w:lastRenderedPageBreak/>
-        <w:t>codigo_inscricao</w:t>
-      </w:r>
-      <w:proofErr w:type="spellEnd"/>
-      <w:r>
-        <w:t xml:space="preserve"> - </w:t>
+      <w:r>
+        <w:t>c</w:t>
+      </w:r>
+      <w:r>
+        <w:t>d</w:t>
+      </w:r>
+      <w:r>
+        <w:t xml:space="preserve">_inscricao - </w:t>
       </w:r>
       <w:r>
         <w:rPr>
@@ -1508,6 +1393,9 @@
         </w:numPr>
       </w:pPr>
       <w:r>
+        <w:t>st_</w:t>
+      </w:r>
+      <w:r>
         <w:t>estado - Representa o estado atual da inscrição, podendo assumir valores como CONFIRMADA, INVALIDADA_POR_INATIVACAO, CANCELADA_POR_EVENTO, CANCELADA_A_PEDIDO ou ENCERRADA_POR_FALTAS.</w:t>
       </w:r>
     </w:p>
@@ -1519,13 +1407,11 @@
           <w:numId w:val="29"/>
         </w:numPr>
       </w:pPr>
-      <w:proofErr w:type="spellStart"/>
-      <w:r>
-        <w:t>motivo_cancelamento</w:t>
-      </w:r>
-      <w:proofErr w:type="spellEnd"/>
-      <w:r>
-        <w:t xml:space="preserve"> - Motivo opcional informado quando uma inscrição é cancelada a pedido pela equipe interna.</w:t>
+      <w:r>
+        <w:t>ds_</w:t>
+      </w:r>
+      <w:r>
+        <w:t>motivo_cancelamento - Motivo opcional informado quando uma inscrição é cancelada a pedido pela equipe interna.</w:t>
       </w:r>
     </w:p>
     <w:p>
@@ -1536,34 +1422,16 @@
           <w:numId w:val="29"/>
         </w:numPr>
       </w:pPr>
-      <w:proofErr w:type="spellStart"/>
-      <w:r>
-        <w:t>faltas_consecutivas</w:t>
-      </w:r>
-      <w:proofErr w:type="spellEnd"/>
-      <w:r>
-        <w:t xml:space="preserve"> - Quantidade de faltas consecutivas acumuladas pelo participante, utilizada para controlar o encerramento por faltas em eventos recorrentes sem previsão de fim.</w:t>
-      </w:r>
-    </w:p>
-    <w:p>
-      <w:r>
-        <w:t xml:space="preserve">Além da chave primária, a combinação entre </w:t>
-      </w:r>
-      <w:proofErr w:type="spellStart"/>
-      <w:r>
-        <w:t>id_pessoa</w:t>
-      </w:r>
-      <w:proofErr w:type="spellEnd"/>
-      <w:r>
-        <w:t xml:space="preserve"> e </w:t>
-      </w:r>
-      <w:proofErr w:type="spellStart"/>
-      <w:r>
-        <w:t>id_evento</w:t>
-      </w:r>
-      <w:proofErr w:type="spellEnd"/>
-      <w:r>
-        <w:t xml:space="preserve"> deve possuir uma restrição </w:t>
+      <w:r>
+        <w:t>nr_</w:t>
+      </w:r>
+      <w:r>
+        <w:t>faltas_consecutivas - Quantidade de faltas consecutivas acumuladas pelo participante, utilizada para controlar o encerramento por faltas em eventos recorrentes sem previsão de fim.</w:t>
+      </w:r>
+    </w:p>
+    <w:p>
+      <w:r>
+        <w:t xml:space="preserve">Além da chave primária, a combinação entre id_pessoa e id_evento deve possuir uma restrição </w:t>
       </w:r>
       <w:r>
         <w:rPr>
@@ -1599,13 +1467,8 @@
           <w:numId w:val="31"/>
         </w:numPr>
       </w:pPr>
-      <w:proofErr w:type="spellStart"/>
-      <w:r>
-        <w:t>id_presenca</w:t>
-      </w:r>
-      <w:proofErr w:type="spellEnd"/>
-      <w:r>
-        <w:t xml:space="preserve"> - </w:t>
+      <w:r>
+        <w:t xml:space="preserve">id_presenca - </w:t>
       </w:r>
       <w:r>
         <w:rPr>
@@ -1626,13 +1489,8 @@
           <w:numId w:val="31"/>
         </w:numPr>
       </w:pPr>
-      <w:proofErr w:type="spellStart"/>
-      <w:r>
-        <w:t>id_inscricao</w:t>
-      </w:r>
-      <w:proofErr w:type="spellEnd"/>
-      <w:r>
-        <w:t xml:space="preserve"> - </w:t>
+      <w:r>
+        <w:t xml:space="preserve">id_inscricao - </w:t>
       </w:r>
       <w:r>
         <w:rPr>
@@ -1653,13 +1511,8 @@
           <w:numId w:val="31"/>
         </w:numPr>
       </w:pPr>
-      <w:proofErr w:type="spellStart"/>
-      <w:r>
-        <w:t>id_ocorrencia</w:t>
-      </w:r>
-      <w:proofErr w:type="spellEnd"/>
-      <w:r>
-        <w:t xml:space="preserve"> - </w:t>
+      <w:r>
+        <w:t xml:space="preserve">id_ocorrencia - </w:t>
       </w:r>
       <w:r>
         <w:rPr>
@@ -1680,34 +1533,16 @@
           <w:numId w:val="31"/>
         </w:numPr>
       </w:pPr>
-      <w:proofErr w:type="spellStart"/>
-      <w:r>
-        <w:t>situacao_presenca</w:t>
-      </w:r>
-      <w:proofErr w:type="spellEnd"/>
-      <w:r>
-        <w:t xml:space="preserve"> - Indica o resultado da participação naquela ocorrência, permitindo representar presença ou falta.</w:t>
-      </w:r>
-    </w:p>
-    <w:p>
-      <w:r>
-        <w:t xml:space="preserve">A combinação entre </w:t>
-      </w:r>
-      <w:proofErr w:type="spellStart"/>
-      <w:r>
-        <w:t>id_inscricao</w:t>
-      </w:r>
-      <w:proofErr w:type="spellEnd"/>
-      <w:r>
-        <w:t xml:space="preserve"> e </w:t>
-      </w:r>
-      <w:proofErr w:type="spellStart"/>
-      <w:r>
-        <w:t>id_ocorrencia</w:t>
-      </w:r>
-      <w:proofErr w:type="spellEnd"/>
-      <w:r>
-        <w:t xml:space="preserve"> deve possuir uma restrição </w:t>
+      <w:r>
+        <w:t>st_</w:t>
+      </w:r>
+      <w:r>
+        <w:t>situacao_presenca - Indica o resultado da participação naquela ocorrência, permitindo representar presença ou falta.</w:t>
+      </w:r>
+    </w:p>
+    <w:p>
+      <w:r>
+        <w:t xml:space="preserve">A combinação entre id_inscricao e id_ocorrencia deve possuir uma restrição </w:t>
       </w:r>
       <w:r>
         <w:rPr>
@@ -1787,16 +1622,19 @@
         <w:t>Endereço</w:t>
       </w:r>
       <w:r>
-        <w:t xml:space="preserve"> pertence a uma única pessoa. A documentação estabelece que os dados de endereço fazem parte obrigatória do cadastro pessoal, incluindo CEP, logradouro, número, bairro, município e UF. </w:t>
-      </w:r>
-    </w:p>
-    <w:p>
-      <w:r>
-        <w:rPr>
-          <w:b/>
-          <w:bCs/>
-        </w:rPr>
+        <w:t xml:space="preserve"> pertence a uma única pessoa. A documentação estabelece que os dados de endereço fazem parte </w:t>
+      </w:r>
+      <w:r>
         <w:lastRenderedPageBreak/>
+        <w:t xml:space="preserve">obrigatória do cadastro pessoal, incluindo CEP, logradouro, número, bairro, município e UF. </w:t>
+      </w:r>
+    </w:p>
+    <w:p>
+      <w:r>
+        <w:rPr>
+          <w:b/>
+          <w:bCs/>
+        </w:rPr>
         <w:t>Cardinalidade:</w:t>
       </w:r>
     </w:p>
@@ -1970,6 +1808,7 @@
     </w:p>
     <w:p>
       <w:r>
+        <w:lastRenderedPageBreak/>
         <w:t xml:space="preserve">Uma </w:t>
       </w:r>
       <w:r>
@@ -2005,28 +1844,288 @@
     </w:p>
     <w:p>
       <w:r>
+        <w:t xml:space="preserve">Essa separação existe porque os dados pessoais permanecem em </w:t>
+      </w:r>
+      <w:r>
+        <w:rPr>
+          <w:b/>
+          <w:bCs/>
+        </w:rPr>
+        <w:t>Pessoa</w:t>
+      </w:r>
+      <w:r>
+        <w:t xml:space="preserve">, enquanto </w:t>
+      </w:r>
+      <w:r>
+        <w:rPr>
+          <w:b/>
+          <w:bCs/>
+        </w:rPr>
+        <w:t>Responsável</w:t>
+      </w:r>
+      <w:r>
+        <w:t xml:space="preserve"> mantém a informação específica desse papel, como a descrição de atuação. </w:t>
+      </w:r>
+    </w:p>
+    <w:p>
+      <w:r>
+        <w:rPr>
+          <w:b/>
+          <w:bCs/>
+        </w:rPr>
+        <w:t>Cardinalidade:</w:t>
+      </w:r>
+    </w:p>
+    <w:p>
+      <w:r>
+        <w:t>Pessoa (1) —— (0..1) Responsável</w:t>
+      </w:r>
+    </w:p>
+    <w:p>
+      <w:r>
+        <w:t>Uma pessoa que não seja responsável não terá registro nessa entidade; uma pessoa que exerça esse papel terá um registro associado ao seu cadastro pessoal.</w:t>
+      </w:r>
+    </w:p>
+    <w:p/>
+    <w:p>
+      <w:r>
+        <w:rPr>
+          <w:b/>
+          <w:bCs/>
+        </w:rPr>
+        <w:t>Pessoa — Inscrição: relacionamento 1:N</w:t>
+      </w:r>
+    </w:p>
+    <w:p>
+      <w:r>
+        <w:t xml:space="preserve">Uma </w:t>
+      </w:r>
+      <w:r>
+        <w:rPr>
+          <w:b/>
+          <w:bCs/>
+        </w:rPr>
+        <w:t>Pessoa</w:t>
+      </w:r>
+      <w:r>
+        <w:t xml:space="preserve">, quando atua como participante, pode realizar inscrições em vários eventos. Cada </w:t>
+      </w:r>
+      <w:r>
+        <w:rPr>
+          <w:b/>
+          <w:bCs/>
+        </w:rPr>
+        <w:t>Inscrição</w:t>
+      </w:r>
+      <w:r>
+        <w:t>, entretanto, pertence a uma única pessoa.</w:t>
+      </w:r>
+    </w:p>
+    <w:p>
+      <w:r>
+        <w:t xml:space="preserve">A documentação determina ainda que deve existir no máximo uma inscrição para cada combinação entre participante e evento. </w:t>
+      </w:r>
+    </w:p>
+    <w:p>
+      <w:r>
+        <w:rPr>
+          <w:b/>
+          <w:bCs/>
+        </w:rPr>
+        <w:t>Cardinalidade:</w:t>
+      </w:r>
+    </w:p>
+    <w:p>
+      <w:r>
+        <w:t>Pessoa (1) —— (N) Inscrição</w:t>
+      </w:r>
+    </w:p>
+    <w:p>
+      <w:r>
+        <w:t>Assim, uma pessoa pode possuir nenhuma ou várias inscrições ao longo do tempo, mas cada registro de inscrição estará associado a exatamente uma pessoa.</w:t>
+      </w:r>
+    </w:p>
+    <w:p/>
+    <w:p>
+      <w:pPr>
+        <w:rPr>
+          <w:b/>
+          <w:bCs/>
+        </w:rPr>
+      </w:pPr>
+      <w:r>
+        <w:rPr>
+          <w:b/>
+          <w:bCs/>
+        </w:rPr>
+        <w:t>Endereço</w:t>
+      </w:r>
+    </w:p>
+    <w:p>
+      <w:r>
+        <w:t>P</w:t>
+      </w:r>
+      <w:r>
+        <w:t xml:space="preserve">ossui relacionamento direto somente com a entidade </w:t>
+      </w:r>
+      <w:r>
+        <w:rPr>
+          <w:b/>
+          <w:bCs/>
+        </w:rPr>
+        <w:t>Pessoa</w:t>
+      </w:r>
+      <w:r>
+        <w:t>.</w:t>
+      </w:r>
+    </w:p>
+    <w:p>
+      <w:r>
+        <w:rPr>
+          <w:b/>
+          <w:bCs/>
+        </w:rPr>
+        <w:t>Endereço — Pessoa: relacionamento 1:1</w:t>
+      </w:r>
+    </w:p>
+    <w:p>
+      <w:r>
+        <w:t xml:space="preserve">Cada </w:t>
+      </w:r>
+      <w:r>
+        <w:rPr>
+          <w:b/>
+          <w:bCs/>
+        </w:rPr>
+        <w:t>Endereço</w:t>
+      </w:r>
+      <w:r>
+        <w:t xml:space="preserve"> pertence a uma única </w:t>
+      </w:r>
+      <w:r>
+        <w:rPr>
+          <w:b/>
+          <w:bCs/>
+        </w:rPr>
+        <w:t>Pessoa</w:t>
+      </w:r>
+      <w:r>
+        <w:t xml:space="preserve">, e cada </w:t>
+      </w:r>
+      <w:r>
+        <w:rPr>
+          <w:b/>
+          <w:bCs/>
+        </w:rPr>
+        <w:t>Pessoa</w:t>
+      </w:r>
+      <w:r>
+        <w:t xml:space="preserve"> possui um único endereço cadastrado no modelo atual.</w:t>
+      </w:r>
+    </w:p>
+    <w:p>
+      <w:r>
+        <w:t xml:space="preserve">A documentação trata CEP, logradouro, número, bairro, município e UF como parte do cadastro obrigatório da pessoa, enquanto complemento é opcional. O documento também determina que, antes de salvar o cadastro, os campos obrigatórios do endereço devem estar preenchidos. </w:t>
+      </w:r>
+    </w:p>
+    <w:p>
+      <w:r>
+        <w:rPr>
+          <w:b/>
+          <w:bCs/>
+        </w:rPr>
+        <w:t>Cardinalidade:</w:t>
+      </w:r>
+    </w:p>
+    <w:p>
+      <w:r>
+        <w:t>Pessoa (1) —— (1) Endereço</w:t>
+      </w:r>
+    </w:p>
+    <w:p>
+      <w:r>
         <w:lastRenderedPageBreak/>
-        <w:t xml:space="preserve">Essa separação existe porque os dados pessoais permanecem em </w:t>
-      </w:r>
-      <w:r>
-        <w:rPr>
-          <w:b/>
-          <w:bCs/>
-        </w:rPr>
-        <w:t>Pessoa</w:t>
-      </w:r>
-      <w:r>
-        <w:t xml:space="preserve">, enquanto </w:t>
-      </w:r>
-      <w:r>
-        <w:rPr>
-          <w:b/>
-          <w:bCs/>
-        </w:rPr>
-        <w:t>Responsável</w:t>
-      </w:r>
-      <w:r>
-        <w:t xml:space="preserve"> mantém a informação específica desse papel, como a descrição de atuação. </w:t>
+        <w:t>Portanto, Endereço não possui relacionamento direto com Evento, Inscrição, Papel, Usuário Interno ou qualquer outra entidade. Essas informações podem utilizar dados do endereço indiretamente — por exemplo, os relatórios territoriais utilizam localização — mas isso não cria um relacionamento direto entre essas tabelas. A documentação prevê o uso de bairro, município, UF e CEP para informações territoriais agregadas.</w:t>
+      </w:r>
+    </w:p>
+    <w:p/>
+    <w:p>
+      <w:r>
+        <w:rPr>
+          <w:b/>
+          <w:bCs/>
+        </w:rPr>
+        <w:t>Papel</w:t>
+      </w:r>
+      <w:r>
+        <w:t xml:space="preserve"> </w:t>
+      </w:r>
+    </w:p>
+    <w:p>
+      <w:r>
+        <w:t>P</w:t>
+      </w:r>
+      <w:r>
+        <w:t xml:space="preserve">ossui relacionamento direto somente com a entidade </w:t>
+      </w:r>
+      <w:r>
+        <w:rPr>
+          <w:b/>
+          <w:bCs/>
+        </w:rPr>
+        <w:t>Pessoa_Papel</w:t>
+      </w:r>
+      <w:r>
+        <w:t>.</w:t>
+      </w:r>
+    </w:p>
+    <w:p>
+      <w:r>
+        <w:rPr>
+          <w:b/>
+          <w:bCs/>
+        </w:rPr>
+        <w:t>Papel — Pessoa_Papel: relacionamento 1:N</w:t>
+      </w:r>
+    </w:p>
+    <w:p>
+      <w:r>
+        <w:t xml:space="preserve">Um </w:t>
+      </w:r>
+      <w:r>
+        <w:rPr>
+          <w:b/>
+          <w:bCs/>
+        </w:rPr>
+        <w:t>Papel</w:t>
+      </w:r>
+      <w:r>
+        <w:t xml:space="preserve"> pode estar associado a vários registros da entidade </w:t>
+      </w:r>
+      <w:r>
+        <w:rPr>
+          <w:b/>
+          <w:bCs/>
+        </w:rPr>
+        <w:t>Pessoa_Papel</w:t>
+      </w:r>
+      <w:r>
+        <w:t xml:space="preserve">, pois o mesmo papel pode ser atribuído a diversas pessoas. Cada registro de </w:t>
+      </w:r>
+      <w:r>
+        <w:rPr>
+          <w:b/>
+          <w:bCs/>
+        </w:rPr>
+        <w:t>Pessoa_Papel</w:t>
+      </w:r>
+      <w:r>
+        <w:t>, porém, referencia apenas um único papel.</w:t>
+      </w:r>
+    </w:p>
+    <w:p>
+      <w:r>
+        <w:t xml:space="preserve">A documentação estabelece que uma mesma pessoa pode acumular os papéis de participante, responsável, colaborador e administrador, sem duplicação do cadastro pessoal. </w:t>
       </w:r>
     </w:p>
     <w:p>
@@ -2040,198 +2139,12 @@
     </w:p>
     <w:p>
       <w:r>
-        <w:t>Pessoa (1) —— (0..1) Responsável</w:t>
-      </w:r>
-    </w:p>
-    <w:p>
-      <w:r>
-        <w:t>Uma pessoa que não seja responsável não terá registro nessa entidade; uma pessoa que exerça esse papel terá um registro associado ao seu cadastro pessoal.</w:t>
-      </w:r>
-    </w:p>
-    <w:p/>
-    <w:p>
-      <w:r>
-        <w:rPr>
-          <w:b/>
-          <w:bCs/>
-        </w:rPr>
-        <w:t>Pessoa — Inscrição: relacionamento 1:N</w:t>
-      </w:r>
-    </w:p>
-    <w:p>
-      <w:r>
-        <w:t xml:space="preserve">Uma </w:t>
-      </w:r>
-      <w:r>
-        <w:rPr>
-          <w:b/>
-          <w:bCs/>
-        </w:rPr>
-        <w:t>Pessoa</w:t>
-      </w:r>
-      <w:r>
-        <w:t xml:space="preserve">, quando atua como participante, pode realizar inscrições em vários eventos. Cada </w:t>
-      </w:r>
-      <w:r>
-        <w:rPr>
-          <w:b/>
-          <w:bCs/>
-        </w:rPr>
-        <w:t>Inscrição</w:t>
-      </w:r>
-      <w:r>
-        <w:t>, entretanto, pertence a uma única pessoa.</w:t>
-      </w:r>
-    </w:p>
-    <w:p>
-      <w:r>
-        <w:t xml:space="preserve">A documentação determina ainda que deve existir no máximo uma inscrição para cada combinação entre participante e evento. </w:t>
-      </w:r>
-    </w:p>
-    <w:p>
-      <w:r>
-        <w:rPr>
-          <w:b/>
-          <w:bCs/>
-        </w:rPr>
-        <w:t>Cardinalidade:</w:t>
-      </w:r>
-    </w:p>
-    <w:p>
-      <w:r>
-        <w:t>Pessoa (1) —— (N) Inscrição</w:t>
-      </w:r>
-    </w:p>
-    <w:p>
-      <w:r>
-        <w:t>Assim, uma pessoa pode possuir nenhuma ou várias inscrições ao longo do tempo, mas cada registro de inscrição estará associado a exatamente uma pessoa.</w:t>
-      </w:r>
-    </w:p>
-    <w:p/>
-    <w:p>
-      <w:pPr>
-        <w:rPr>
-          <w:b/>
-          <w:bCs/>
-        </w:rPr>
-      </w:pPr>
-      <w:r>
-        <w:rPr>
-          <w:b/>
-          <w:bCs/>
-        </w:rPr>
-        <w:t>Endereço</w:t>
-      </w:r>
-    </w:p>
-    <w:p>
-      <w:r>
-        <w:t>P</w:t>
-      </w:r>
-      <w:r>
-        <w:t xml:space="preserve">ossui relacionamento direto somente com a entidade </w:t>
-      </w:r>
-      <w:r>
-        <w:rPr>
-          <w:b/>
-          <w:bCs/>
-        </w:rPr>
-        <w:t>Pessoa</w:t>
-      </w:r>
-      <w:r>
-        <w:t>.</w:t>
-      </w:r>
-    </w:p>
-    <w:p>
-      <w:r>
-        <w:rPr>
-          <w:b/>
-          <w:bCs/>
-        </w:rPr>
-        <w:t>Endereço — Pessoa: relacionamento 1:1</w:t>
-      </w:r>
-    </w:p>
-    <w:p>
-      <w:r>
-        <w:t xml:space="preserve">Cada </w:t>
-      </w:r>
-      <w:r>
-        <w:rPr>
-          <w:b/>
-          <w:bCs/>
-        </w:rPr>
-        <w:t>Endereço</w:t>
-      </w:r>
-      <w:r>
-        <w:t xml:space="preserve"> pertence a uma única </w:t>
-      </w:r>
-      <w:r>
-        <w:rPr>
-          <w:b/>
-          <w:bCs/>
-        </w:rPr>
-        <w:t>Pessoa</w:t>
-      </w:r>
-      <w:r>
-        <w:t xml:space="preserve">, e cada </w:t>
-      </w:r>
-      <w:r>
-        <w:rPr>
-          <w:b/>
-          <w:bCs/>
-        </w:rPr>
-        <w:t>Pessoa</w:t>
-      </w:r>
-      <w:r>
-        <w:t xml:space="preserve"> possui um único endereço cadastrado no modelo atual.</w:t>
-      </w:r>
-    </w:p>
-    <w:p>
-      <w:r>
-        <w:t xml:space="preserve">A documentação trata CEP, logradouro, número, bairro, município e UF como parte do cadastro obrigatório da pessoa, enquanto complemento é opcional. O documento também determina que, antes de salvar o cadastro, os campos obrigatórios do endereço devem estar preenchidos. </w:t>
-      </w:r>
-    </w:p>
-    <w:p>
-      <w:r>
-        <w:rPr>
-          <w:b/>
-          <w:bCs/>
-        </w:rPr>
-        <w:t>Cardinalidade:</w:t>
-      </w:r>
-    </w:p>
-    <w:p>
-      <w:r>
-        <w:t>Pessoa (1) —— (1) Endereço</w:t>
-      </w:r>
-    </w:p>
-    <w:p>
-      <w:r>
-        <w:t xml:space="preserve">Portanto, Endereço não possui relacionamento direto com Evento, Inscrição, Papel, Usuário Interno ou qualquer outra entidade. Essas informações podem </w:t>
-      </w:r>
-      <w:r>
-        <w:lastRenderedPageBreak/>
-        <w:t>utilizar dados do endereço indiretamente — por exemplo, os relatórios territoriais utilizam localização — mas isso não cria um relacionamento direto entre essas tabelas. A documentação prevê o uso de bairro, município, UF e CEP para informações territoriais agregadas.</w:t>
-      </w:r>
-    </w:p>
-    <w:p/>
-    <w:p>
-      <w:r>
-        <w:rPr>
-          <w:b/>
-          <w:bCs/>
-        </w:rPr>
-        <w:t>Papel</w:t>
-      </w:r>
-      <w:r>
-        <w:t xml:space="preserve"> </w:t>
-      </w:r>
-    </w:p>
-    <w:p>
-      <w:r>
-        <w:t>P</w:t>
-      </w:r>
-      <w:r>
-        <w:t xml:space="preserve">ossui relacionamento direto somente com a entidade </w:t>
+        <w:t>Papel (1) —— (N) Pessoa_Papel</w:t>
+      </w:r>
+    </w:p>
+    <w:p>
+      <w:r>
+        <w:t xml:space="preserve">No modelo lógico, esse relacionamento é implementado por meio da chave estrangeira id_papel armazenada em </w:t>
       </w:r>
       <w:r>
         <w:rPr>
@@ -2240,104 +2153,6 @@
         </w:rPr>
         <w:t>Pessoa_Papel</w:t>
       </w:r>
-      <w:r>
-        <w:t>.</w:t>
-      </w:r>
-    </w:p>
-    <w:p>
-      <w:r>
-        <w:rPr>
-          <w:b/>
-          <w:bCs/>
-        </w:rPr>
-        <w:t>Papel — Pessoa_Papel: relacionamento 1:N</w:t>
-      </w:r>
-    </w:p>
-    <w:p>
-      <w:r>
-        <w:t xml:space="preserve">Um </w:t>
-      </w:r>
-      <w:r>
-        <w:rPr>
-          <w:b/>
-          <w:bCs/>
-        </w:rPr>
-        <w:t>Papel</w:t>
-      </w:r>
-      <w:r>
-        <w:t xml:space="preserve"> pode estar associado a vários registros da entidade </w:t>
-      </w:r>
-      <w:r>
-        <w:rPr>
-          <w:b/>
-          <w:bCs/>
-        </w:rPr>
-        <w:t>Pessoa_Papel</w:t>
-      </w:r>
-      <w:r>
-        <w:t xml:space="preserve">, pois o mesmo papel pode ser atribuído a diversas pessoas. Cada registro de </w:t>
-      </w:r>
-      <w:proofErr w:type="spellStart"/>
-      <w:r>
-        <w:rPr>
-          <w:b/>
-          <w:bCs/>
-        </w:rPr>
-        <w:t>Pessoa_Papel</w:t>
-      </w:r>
-      <w:proofErr w:type="spellEnd"/>
-      <w:r>
-        <w:t xml:space="preserve">, porém, </w:t>
-      </w:r>
-      <w:proofErr w:type="spellStart"/>
-      <w:r>
-        <w:t>referencia</w:t>
-      </w:r>
-      <w:proofErr w:type="spellEnd"/>
-      <w:r>
-        <w:t xml:space="preserve"> apenas um único papel.</w:t>
-      </w:r>
-    </w:p>
-    <w:p>
-      <w:r>
-        <w:t xml:space="preserve">A documentação estabelece que uma mesma pessoa pode acumular os papéis de participante, responsável, colaborador e administrador, sem duplicação do cadastro pessoal. </w:t>
-      </w:r>
-    </w:p>
-    <w:p>
-      <w:r>
-        <w:rPr>
-          <w:b/>
-          <w:bCs/>
-        </w:rPr>
-        <w:t>Cardinalidade:</w:t>
-      </w:r>
-    </w:p>
-    <w:p>
-      <w:r>
-        <w:t>Papel (1) —— (N) Pessoa_Papel</w:t>
-      </w:r>
-    </w:p>
-    <w:p>
-      <w:r>
-        <w:t xml:space="preserve">No modelo lógico, esse relacionamento é implementado por meio da chave estrangeira </w:t>
-      </w:r>
-      <w:proofErr w:type="spellStart"/>
-      <w:r>
-        <w:t>id_papel</w:t>
-      </w:r>
-      <w:proofErr w:type="spellEnd"/>
-      <w:r>
-        <w:t xml:space="preserve"> armazenada em </w:t>
-      </w:r>
-      <w:proofErr w:type="spellStart"/>
-      <w:r>
-        <w:rPr>
-          <w:b/>
-          <w:bCs/>
-        </w:rPr>
-        <w:t>Pessoa_Papel</w:t>
-      </w:r>
-      <w:proofErr w:type="spellEnd"/>
       <w:r>
         <w:t>.</w:t>
       </w:r>
@@ -2501,17 +2316,8 @@
     </w:p>
     <w:p>
       <w:r>
-        <w:t xml:space="preserve">No modelo lógico, esse relacionamento é implementado pela chave estrangeira </w:t>
-      </w:r>
-      <w:proofErr w:type="spellStart"/>
-      <w:r>
-        <w:t>id_pessoa</w:t>
-      </w:r>
-      <w:proofErr w:type="spellEnd"/>
-      <w:r>
-        <w:t xml:space="preserve"> armazenada em </w:t>
-      </w:r>
-      <w:proofErr w:type="spellStart"/>
+        <w:t xml:space="preserve">No modelo lógico, esse relacionamento é implementado pela chave estrangeira id_pessoa armazenada em </w:t>
+      </w:r>
       <w:r>
         <w:rPr>
           <w:b/>
@@ -2519,7 +2325,6 @@
         </w:rPr>
         <w:t>Pessoa_Papel</w:t>
       </w:r>
-      <w:proofErr w:type="spellEnd"/>
       <w:r>
         <w:t>.</w:t>
       </w:r>
@@ -2558,7 +2363,6 @@
       <w:r>
         <w:t xml:space="preserve">, já que um mesmo papel pode ser atribuído a várias pessoas. Cada registro de </w:t>
       </w:r>
-      <w:proofErr w:type="spellStart"/>
       <w:r>
         <w:rPr>
           <w:b/>
@@ -2566,17 +2370,8 @@
         </w:rPr>
         <w:t>Pessoa_Papel</w:t>
       </w:r>
-      <w:proofErr w:type="spellEnd"/>
-      <w:r>
-        <w:t xml:space="preserve"> </w:t>
-      </w:r>
-      <w:proofErr w:type="spellStart"/>
-      <w:r>
-        <w:t>referencia</w:t>
-      </w:r>
-      <w:proofErr w:type="spellEnd"/>
-      <w:r>
-        <w:t xml:space="preserve"> apenas um único papel.</w:t>
+      <w:r>
+        <w:t xml:space="preserve"> referencia apenas um único papel.</w:t>
       </w:r>
     </w:p>
     <w:p>
@@ -2630,17 +2425,8 @@
     </w:p>
     <w:p>
       <w:r>
-        <w:t xml:space="preserve">No modelo lógico, esse relacionamento é implementado pela chave estrangeira </w:t>
-      </w:r>
-      <w:proofErr w:type="spellStart"/>
-      <w:r>
-        <w:t>id_papel</w:t>
-      </w:r>
-      <w:proofErr w:type="spellEnd"/>
-      <w:r>
-        <w:t xml:space="preserve"> armazenada em </w:t>
-      </w:r>
-      <w:proofErr w:type="spellStart"/>
+        <w:t xml:space="preserve">No modelo lógico, esse relacionamento é implementado pela chave estrangeira id_papel armazenada em </w:t>
+      </w:r>
       <w:r>
         <w:rPr>
           <w:b/>
@@ -2648,7 +2434,6 @@
         </w:rPr>
         <w:t>Pessoa_Papel</w:t>
       </w:r>
-      <w:proofErr w:type="spellEnd"/>
       <w:r>
         <w:t>.</w:t>
       </w:r>
@@ -2805,15 +2590,7 @@
     </w:p>
     <w:p>
       <w:r>
-        <w:t xml:space="preserve">No modelo lógico, esse relacionamento é implementado pela chave estrangeira </w:t>
-      </w:r>
-      <w:proofErr w:type="spellStart"/>
-      <w:r>
-        <w:t>id_pessoa</w:t>
-      </w:r>
-      <w:proofErr w:type="spellEnd"/>
-      <w:r>
-        <w:t xml:space="preserve"> armazenada em </w:t>
+        <w:t xml:space="preserve">No modelo lógico, esse relacionamento é implementado pela chave estrangeira id_pessoa armazenada em </w:t>
       </w:r>
       <w:r>
         <w:rPr>
@@ -2975,15 +2752,7 @@
     </w:p>
     <w:p>
       <w:r>
-        <w:t xml:space="preserve">No modelo lógico, esse relacionamento é implementado pela chave estrangeira </w:t>
-      </w:r>
-      <w:proofErr w:type="spellStart"/>
-      <w:r>
-        <w:t>id_pessoa</w:t>
-      </w:r>
-      <w:proofErr w:type="spellEnd"/>
-      <w:r>
-        <w:t xml:space="preserve"> armazenada em </w:t>
+        <w:t xml:space="preserve">No modelo lógico, esse relacionamento é implementado pela chave estrangeira id_pessoa armazenada em </w:t>
       </w:r>
       <w:r>
         <w:rPr>
@@ -3030,7 +2799,6 @@
       <w:r>
         <w:t xml:space="preserve">, pois a mesma pessoa responsável pode participar da realização de diferentes eventos. Cada registro de </w:t>
       </w:r>
-      <w:proofErr w:type="spellStart"/>
       <w:r>
         <w:rPr>
           <w:b/>
@@ -3038,17 +2806,8 @@
         </w:rPr>
         <w:t>Evento_Responsavel</w:t>
       </w:r>
-      <w:proofErr w:type="spellEnd"/>
-      <w:r>
-        <w:t xml:space="preserve">, entretanto, </w:t>
-      </w:r>
-      <w:proofErr w:type="spellStart"/>
-      <w:r>
-        <w:t>referencia</w:t>
-      </w:r>
-      <w:proofErr w:type="spellEnd"/>
-      <w:r>
-        <w:t xml:space="preserve"> apenas um único responsável.</w:t>
+      <w:r>
+        <w:t>, entretanto, referencia apenas um único responsável.</w:t>
       </w:r>
     </w:p>
     <w:p>
@@ -3072,17 +2831,8 @@
     </w:p>
     <w:p>
       <w:r>
-        <w:t xml:space="preserve">No modelo lógico, esse relacionamento é implementado pela chave estrangeira </w:t>
-      </w:r>
-      <w:proofErr w:type="spellStart"/>
-      <w:r>
-        <w:t>id_responsavel</w:t>
-      </w:r>
-      <w:proofErr w:type="spellEnd"/>
-      <w:r>
-        <w:t xml:space="preserve"> armazenada em </w:t>
-      </w:r>
-      <w:proofErr w:type="spellStart"/>
+        <w:t xml:space="preserve">No modelo lógico, esse relacionamento é implementado pela chave estrangeira id_responsavel armazenada em </w:t>
+      </w:r>
       <w:r>
         <w:rPr>
           <w:b/>
@@ -3090,7 +2840,6 @@
         </w:rPr>
         <w:t>Evento_Responsavel</w:t>
       </w:r>
-      <w:proofErr w:type="spellEnd"/>
       <w:r>
         <w:t>.</w:t>
       </w:r>
@@ -3244,17 +2993,8 @@
     <w:p>
       <w:r>
         <w:lastRenderedPageBreak/>
-        <w:t xml:space="preserve">No modelo lógico, esse relacionamento é implementado pela chave estrangeira </w:t>
-      </w:r>
-      <w:proofErr w:type="spellStart"/>
-      <w:r>
-        <w:t>id_evento</w:t>
-      </w:r>
-      <w:proofErr w:type="spellEnd"/>
-      <w:r>
-        <w:t xml:space="preserve"> armazenada em </w:t>
-      </w:r>
-      <w:proofErr w:type="spellStart"/>
+        <w:t xml:space="preserve">No modelo lógico, esse relacionamento é implementado pela chave estrangeira id_evento armazenada em </w:t>
+      </w:r>
       <w:r>
         <w:rPr>
           <w:b/>
@@ -3262,7 +3002,6 @@
         </w:rPr>
         <w:t>Evento_Responsavel</w:t>
       </w:r>
-      <w:proofErr w:type="spellEnd"/>
       <w:r>
         <w:t>.</w:t>
       </w:r>
@@ -3318,15 +3057,7 @@
     </w:p>
     <w:p>
       <w:r>
-        <w:t xml:space="preserve">No modelo lógico, esse relacionamento é implementado pela chave estrangeira </w:t>
-      </w:r>
-      <w:proofErr w:type="spellStart"/>
-      <w:r>
-        <w:t>id_evento</w:t>
-      </w:r>
-      <w:proofErr w:type="spellEnd"/>
-      <w:r>
-        <w:t xml:space="preserve"> armazenada em </w:t>
+        <w:t xml:space="preserve">No modelo lógico, esse relacionamento é implementado pela chave estrangeira id_evento armazenada em </w:t>
       </w:r>
       <w:r>
         <w:rPr>
@@ -3410,15 +3141,7 @@
     </w:p>
     <w:p>
       <w:r>
-        <w:t xml:space="preserve">No modelo lógico, esse relacionamento é implementado pela chave estrangeira </w:t>
-      </w:r>
-      <w:proofErr w:type="spellStart"/>
-      <w:r>
-        <w:t>id_evento</w:t>
-      </w:r>
-      <w:proofErr w:type="spellEnd"/>
-      <w:r>
-        <w:t xml:space="preserve"> armazenada em </w:t>
+        <w:t xml:space="preserve">No modelo lógico, esse relacionamento é implementado pela chave estrangeira id_evento armazenada em </w:t>
       </w:r>
       <w:r>
         <w:rPr>
@@ -3570,17 +3293,8 @@
     </w:p>
     <w:p>
       <w:r>
-        <w:t xml:space="preserve">No modelo lógico, esse relacionamento é implementado pela chave estrangeira </w:t>
-      </w:r>
-      <w:proofErr w:type="spellStart"/>
-      <w:r>
-        <w:t>id_evento</w:t>
-      </w:r>
-      <w:proofErr w:type="spellEnd"/>
-      <w:r>
-        <w:t xml:space="preserve"> armazenada em </w:t>
-      </w:r>
-      <w:proofErr w:type="spellStart"/>
+        <w:t xml:space="preserve">No modelo lógico, esse relacionamento é implementado pela chave estrangeira id_evento armazenada em </w:t>
+      </w:r>
       <w:r>
         <w:rPr>
           <w:b/>
@@ -3588,7 +3302,6 @@
         </w:rPr>
         <w:t>Evento_Responsavel</w:t>
       </w:r>
-      <w:proofErr w:type="spellEnd"/>
       <w:r>
         <w:t>.</w:t>
       </w:r>
@@ -3627,7 +3340,6 @@
       <w:r>
         <w:t xml:space="preserve">, pois um responsável pode atuar em diferentes eventos. Cada registro de </w:t>
       </w:r>
-      <w:proofErr w:type="spellStart"/>
       <w:r>
         <w:rPr>
           <w:b/>
@@ -3635,17 +3347,8 @@
         </w:rPr>
         <w:t>Evento_Responsavel</w:t>
       </w:r>
-      <w:proofErr w:type="spellEnd"/>
-      <w:r>
-        <w:t xml:space="preserve">, porém, </w:t>
-      </w:r>
-      <w:proofErr w:type="spellStart"/>
-      <w:r>
-        <w:t>referencia</w:t>
-      </w:r>
-      <w:proofErr w:type="spellEnd"/>
-      <w:r>
-        <w:t xml:space="preserve"> apenas um responsável. A documentação também prevê que o mesmo responsável não pode estar vinculado a ocorrências com horários sobrepostos. </w:t>
+      <w:r>
+        <w:t xml:space="preserve">, porém, referencia apenas um responsável. A documentação também prevê que o mesmo responsável não pode estar vinculado a ocorrências com horários sobrepostos. </w:t>
       </w:r>
     </w:p>
     <w:p>
@@ -3664,17 +3367,8 @@
     </w:p>
     <w:p>
       <w:r>
-        <w:t xml:space="preserve">No modelo lógico, esse relacionamento é implementado pela chave estrangeira </w:t>
-      </w:r>
-      <w:proofErr w:type="spellStart"/>
-      <w:r>
-        <w:t>id_responsavel</w:t>
-      </w:r>
-      <w:proofErr w:type="spellEnd"/>
-      <w:r>
-        <w:t xml:space="preserve"> armazenada em </w:t>
-      </w:r>
-      <w:proofErr w:type="spellStart"/>
+        <w:t xml:space="preserve">No modelo lógico, esse relacionamento é implementado pela chave estrangeira id_responsavel armazenada em </w:t>
+      </w:r>
       <w:r>
         <w:rPr>
           <w:b/>
@@ -3682,7 +3376,6 @@
         </w:rPr>
         <w:t>Evento_Responsavel</w:t>
       </w:r>
-      <w:proofErr w:type="spellEnd"/>
       <w:r>
         <w:t>.</w:t>
       </w:r>
@@ -3821,15 +3514,7 @@
     </w:p>
     <w:p>
       <w:r>
-        <w:t xml:space="preserve">No modelo lógico, esse relacionamento é implementado pela chave estrangeira </w:t>
-      </w:r>
-      <w:proofErr w:type="spellStart"/>
-      <w:r>
-        <w:t>id_evento</w:t>
-      </w:r>
-      <w:proofErr w:type="spellEnd"/>
-      <w:r>
-        <w:t xml:space="preserve"> armazenada em </w:t>
+        <w:t xml:space="preserve">No modelo lógico, esse relacionamento é implementado pela chave estrangeira id_evento armazenada em </w:t>
       </w:r>
       <w:r>
         <w:rPr>
@@ -3898,15 +3583,7 @@
     </w:p>
     <w:p>
       <w:r>
-        <w:t xml:space="preserve">No modelo lógico, esse relacionamento é implementado pela chave estrangeira </w:t>
-      </w:r>
-      <w:proofErr w:type="spellStart"/>
-      <w:r>
-        <w:t>id_ocorrencia</w:t>
-      </w:r>
-      <w:proofErr w:type="spellEnd"/>
-      <w:r>
-        <w:t xml:space="preserve"> armazenada em </w:t>
+        <w:t xml:space="preserve">No modelo lógico, esse relacionamento é implementado pela chave estrangeira id_ocorrencia armazenada em </w:t>
       </w:r>
       <w:r>
         <w:rPr>
@@ -4063,15 +3740,7 @@
     </w:p>
     <w:p>
       <w:r>
-        <w:t xml:space="preserve">No modelo lógico, esse relacionamento é implementado pela chave estrangeira </w:t>
-      </w:r>
-      <w:proofErr w:type="spellStart"/>
-      <w:r>
-        <w:t>id_pessoa</w:t>
-      </w:r>
-      <w:proofErr w:type="spellEnd"/>
-      <w:r>
-        <w:t xml:space="preserve"> armazenada em </w:t>
+        <w:t xml:space="preserve">No modelo lógico, esse relacionamento é implementado pela chave estrangeira id_pessoa armazenada em </w:t>
       </w:r>
       <w:r>
         <w:rPr>
@@ -4140,15 +3809,7 @@
     </w:p>
     <w:p>
       <w:r>
-        <w:t xml:space="preserve">No modelo lógico, esse relacionamento é implementado pela chave estrangeira </w:t>
-      </w:r>
-      <w:proofErr w:type="spellStart"/>
-      <w:r>
-        <w:t>id_evento</w:t>
-      </w:r>
-      <w:proofErr w:type="spellEnd"/>
-      <w:r>
-        <w:t xml:space="preserve"> armazenada em </w:t>
+        <w:t xml:space="preserve">No modelo lógico, esse relacionamento é implementado pela chave estrangeira id_evento armazenada em </w:t>
       </w:r>
       <w:r>
         <w:rPr>
@@ -4163,23 +3824,7 @@
     </w:p>
     <w:p>
       <w:r>
-        <w:t xml:space="preserve">Além disso, a combinação </w:t>
-      </w:r>
-      <w:proofErr w:type="spellStart"/>
-      <w:r>
-        <w:t>id_pessoa</w:t>
-      </w:r>
-      <w:proofErr w:type="spellEnd"/>
-      <w:r>
-        <w:t xml:space="preserve"> + </w:t>
-      </w:r>
-      <w:proofErr w:type="spellStart"/>
-      <w:r>
-        <w:t>id_evento</w:t>
-      </w:r>
-      <w:proofErr w:type="spellEnd"/>
-      <w:r>
-        <w:t xml:space="preserve"> deve ser única, impedindo que a mesma pessoa possua dois registros de inscrição para o mesmo evento. </w:t>
+        <w:t xml:space="preserve">Além disso, a combinação id_pessoa + id_evento deve ser única, impedindo que a mesma pessoa possua dois registros de inscrição para o mesmo evento. </w:t>
       </w:r>
     </w:p>
     <w:p/>
@@ -4259,15 +3904,7 @@
     </w:p>
     <w:p>
       <w:r>
-        <w:t xml:space="preserve">No modelo lógico, esse relacionamento é implementado pela chave estrangeira </w:t>
-      </w:r>
-      <w:proofErr w:type="spellStart"/>
-      <w:r>
-        <w:t>id_inscricao</w:t>
-      </w:r>
-      <w:proofErr w:type="spellEnd"/>
-      <w:r>
-        <w:t xml:space="preserve"> armazenada em </w:t>
+        <w:t xml:space="preserve">No modelo lógico, esse relacionamento é implementado pela chave estrangeira id_inscricao armazenada em </w:t>
       </w:r>
       <w:r>
         <w:rPr>
@@ -4413,15 +4050,7 @@
     </w:p>
     <w:p>
       <w:r>
-        <w:t xml:space="preserve">No modelo lógico, esse relacionamento é implementado pela chave estrangeira </w:t>
-      </w:r>
-      <w:proofErr w:type="spellStart"/>
-      <w:r>
-        <w:t>id_inscricao</w:t>
-      </w:r>
-      <w:proofErr w:type="spellEnd"/>
-      <w:r>
-        <w:t xml:space="preserve"> armazenada em </w:t>
+        <w:t xml:space="preserve">No modelo lógico, esse relacionamento é implementado pela chave estrangeira id_inscricao armazenada em </w:t>
       </w:r>
       <w:r>
         <w:rPr>
@@ -4491,15 +4120,7 @@
     </w:p>
     <w:p>
       <w:r>
-        <w:t xml:space="preserve">No modelo lógico, esse relacionamento é implementado pela chave estrangeira </w:t>
-      </w:r>
-      <w:proofErr w:type="spellStart"/>
-      <w:r>
-        <w:t>id_ocorrencia</w:t>
-      </w:r>
-      <w:proofErr w:type="spellEnd"/>
-      <w:r>
-        <w:t xml:space="preserve"> armazenada em </w:t>
+        <w:t xml:space="preserve">No modelo lógico, esse relacionamento é implementado pela chave estrangeira id_ocorrencia armazenada em </w:t>
       </w:r>
       <w:r>
         <w:rPr>
@@ -4599,7 +4220,7 @@
 </file>
 
 <file path=word/numbering.xml><?xml version="1.0" encoding="utf-8"?>
-<w:numbering xmlns:wpc="http://schemas.microsoft.com/office/word/2010/wordprocessingCanvas" xmlns:cx="http://schemas.microsoft.com/office/drawing/2014/chartex" xmlns:cx1="http://schemas.microsoft.com/office/drawing/2015/9/8/chartex" xmlns:cx2="http://schemas.microsoft.com/office/drawing/2015/10/21/chartex" xmlns:cx3="http://schemas.microsoft.com/office/drawing/2016/5/9/chartex" xmlns:cx4="http://schemas.microsoft.com/office/drawing/2016/5/10/chartex" xmlns:cx5="http://schemas.microsoft.com/office/drawing/2016/5/11/chartex" xmlns:cx6="http://schemas.microsoft.com/office/drawing/2016/5/12/chartex" xmlns:cx7="http://schemas.microsoft.com/office/drawing/2016/5/13/chartex" xmlns:cx8="http://schemas.microsoft.com/office/drawing/2016/5/14/chartex" xmlns:mc="http://schemas.openxmlformats.org/markup-compatibility/2006" xmlns:aink="http://schemas.microsoft.com/office/drawing/2016/ink" xmlns:am3d="http://schemas.microsoft.com/office/drawing/2017/model3d" xmlns:o="urn:schemas-microsoft-com:office:office" xmlns:oel="http://schemas.microsoft.com/office/2019/extlst" xmlns:r="http://schemas.openxmlformats.org/officeDocument/2006/relationships" xmlns:m="http://schemas.openxmlformats.org/officeDocument/2006/math" xmlns:v="urn:schemas-microsoft-com:vml" xmlns:wp14="http://schemas.microsoft.com/office/word/2010/wordprocessingDrawing" xmlns:wp="http://schemas.openxmlformats.org/drawingml/2006/wordprocessingDrawing" xmlns:w10="urn:schemas-microsoft-com:office:word" xmlns:w="http://schemas.openxmlformats.org/wordprocessingml/2006/main" xmlns:w14="http://schemas.microsoft.com/office/word/2010/wordml" xmlns:w15="http://schemas.microsoft.com/office/word/2012/wordml" xmlns:w16cex="http://schemas.microsoft.com/office/word/2018/wordml/cex" xmlns:w16cid="http://schemas.microsoft.com/office/word/2016/wordml/cid" xmlns:w16="http://schemas.microsoft.com/office/word/2018/wordml" xmlns:w16du="http://schemas.microsoft.com/office/word/2023/wordml/word16du" xmlns:w16sdtdh="http://schemas.microsoft.com/office/word/2020/wordml/sdtdatahash" xmlns:w16sdtfl="http://schemas.microsoft.com/office/word/2024/wordml/sdtformatlock" xmlns:w16se="http://schemas.microsoft.com/office/word/2015/wordml/symex" xmlns:wpg="http://schemas.microsoft.com/office/word/2010/wordprocessingGroup" xmlns:wpi="http://schemas.microsoft.com/office/word/2010/wordprocessingInk" xmlns:wne="http://schemas.microsoft.com/office/word/2006/wordml" xmlns:wps="http://schemas.microsoft.com/office/word/2010/wordprocessingShape" mc:Ignorable="w14 w15 w16se w16cid w16 w16cex w16sdtdh w16sdtfl w16du wp14">
+<w:numbering xmlns:wpc="http://schemas.microsoft.com/office/word/2010/wordprocessingCanvas" xmlns:cx="http://schemas.microsoft.com/office/drawing/2014/chartex" xmlns:cx1="http://schemas.microsoft.com/office/drawing/2015/9/8/chartex" xmlns:cx2="http://schemas.microsoft.com/office/drawing/2015/10/21/chartex" xmlns:cx3="http://schemas.microsoft.com/office/drawing/2016/5/9/chartex" xmlns:cx4="http://schemas.microsoft.com/office/drawing/2016/5/10/chartex" xmlns:cx5="http://schemas.microsoft.com/office/drawing/2016/5/11/chartex" xmlns:cx6="http://schemas.microsoft.com/office/drawing/2016/5/12/chartex" xmlns:cx7="http://schemas.microsoft.com/office/drawing/2016/5/13/chartex" xmlns:cx8="http://schemas.microsoft.com/office/drawing/2016/5/14/chartex" xmlns:mc="http://schemas.openxmlformats.org/markup-compatibility/2006" xmlns:aink="http://schemas.microsoft.com/office/drawing/2016/ink" xmlns:am3d="http://schemas.microsoft.com/office/drawing/2017/model3d" xmlns:o="urn:schemas-microsoft-com:office:office" xmlns:oel="http://schemas.microsoft.com/office/2019/extlst" xmlns:r="http://schemas.openxmlformats.org/officeDocument/2006/relationships" xmlns:m="http://schemas.openxmlformats.org/officeDocument/2006/math" xmlns:v="urn:schemas-microsoft-com:vml" xmlns:wp14="http://schemas.microsoft.com/office/word/2010/wordprocessingDrawing" xmlns:wp="http://schemas.openxmlformats.org/drawingml/2006/wordprocessingDrawing" xmlns:w10="urn:schemas-microsoft-com:office:word" xmlns:w="http://schemas.openxmlformats.org/wordprocessingml/2006/main" xmlns:w14="http://schemas.microsoft.com/office/word/2010/wordml" xmlns:w15="http://schemas.microsoft.com/office/word/2012/wordml" xmlns:w16cex="http://schemas.microsoft.com/office/word/2018/wordml/cex" xmlns:w16cid="http://schemas.microsoft.com/office/word/2016/wordml/cid" xmlns:w16="http://schemas.microsoft.com/office/word/2018/wordml" xmlns:w16sdtdh="http://schemas.microsoft.com/office/word/2020/wordml/sdtdatahash" xmlns:w16se="http://schemas.microsoft.com/office/word/2015/wordml/symex" xmlns:wpg="http://schemas.microsoft.com/office/word/2010/wordprocessingGroup" xmlns:wpi="http://schemas.microsoft.com/office/word/2010/wordprocessingInk" xmlns:wne="http://schemas.microsoft.com/office/word/2006/wordml" xmlns:wps="http://schemas.microsoft.com/office/word/2010/wordprocessingShape" mc:Ignorable="w14 w15 w16se w16cid w16 w16cex w16sdtdh wp14">
   <w:abstractNum w:abstractNumId="0" w15:restartNumberingAfterBreak="0">
     <w:nsid w:val="031C6ED4"/>
     <w:multiLevelType w:val="hybridMultilevel"/>
@@ -8197,7 +7818,7 @@
 </file>
 
 <file path=word/styles.xml><?xml version="1.0" encoding="utf-8"?>
-<w:styles xmlns:mc="http://schemas.openxmlformats.org/markup-compatibility/2006" xmlns:r="http://schemas.openxmlformats.org/officeDocument/2006/relationships" xmlns:w="http://schemas.openxmlformats.org/wordprocessingml/2006/main" xmlns:w14="http://schemas.microsoft.com/office/word/2010/wordml" xmlns:w15="http://schemas.microsoft.com/office/word/2012/wordml" xmlns:w16cex="http://schemas.microsoft.com/office/word/2018/wordml/cex" xmlns:w16cid="http://schemas.microsoft.com/office/word/2016/wordml/cid" xmlns:w16="http://schemas.microsoft.com/office/word/2018/wordml" xmlns:w16du="http://schemas.microsoft.com/office/word/2023/wordml/word16du" xmlns:w16sdtdh="http://schemas.microsoft.com/office/word/2020/wordml/sdtdatahash" xmlns:w16sdtfl="http://schemas.microsoft.com/office/word/2024/wordml/sdtformatlock" xmlns:w16se="http://schemas.microsoft.com/office/word/2015/wordml/symex" mc:Ignorable="w14 w15 w16se w16cid w16 w16cex w16sdtdh w16sdtfl w16du">
+<w:styles xmlns:mc="http://schemas.openxmlformats.org/markup-compatibility/2006" xmlns:r="http://schemas.openxmlformats.org/officeDocument/2006/relationships" xmlns:w="http://schemas.openxmlformats.org/wordprocessingml/2006/main" xmlns:w14="http://schemas.microsoft.com/office/word/2010/wordml" xmlns:w15="http://schemas.microsoft.com/office/word/2012/wordml" xmlns:w16cex="http://schemas.microsoft.com/office/word/2018/wordml/cex" xmlns:w16cid="http://schemas.microsoft.com/office/word/2016/wordml/cid" xmlns:w16="http://schemas.microsoft.com/office/word/2018/wordml" xmlns:w16sdtdh="http://schemas.microsoft.com/office/word/2020/wordml/sdtdatahash" xmlns:w16se="http://schemas.microsoft.com/office/word/2015/wordml/symex" mc:Ignorable="w14 w15 w16se w16cid w16 w16cex w16sdtdh">
   <w:docDefaults>
     <w:rPrDefault>
       <w:rPr>

</xml_diff>

<commit_message>
ajuste nos diagramas e finalização do mer
</commit_message>
<xml_diff>
--- a/banco de dados/banco de dados Negra visao.docx
+++ b/banco de dados/banco de dados Negra visao.docx
@@ -232,7 +232,13 @@
         </w:numPr>
       </w:pPr>
       <w:r>
-        <w:t>nome - Nome completo da pessoa.</w:t>
+        <w:t>n</w:t>
+      </w:r>
+      <w:r>
+        <w:t>m_pessoa</w:t>
+      </w:r>
+      <w:r>
+        <w:t xml:space="preserve"> - Nome completo da pessoa.</w:t>
       </w:r>
     </w:p>
     <w:p>
@@ -4199,32 +4205,117 @@
     </w:p>
     <w:p>
       <w:r>
+        <w:t xml:space="preserve">· id_pessoa </w:t>
+      </w:r>
+      <w:r>
+        <w:t>–</w:t>
+      </w:r>
+      <w:r>
+        <w:t xml:space="preserve"> INT</w:t>
+      </w:r>
+    </w:p>
+    <w:p>
+      <w:r>
+        <w:t xml:space="preserve">· </w:t>
+      </w:r>
+      <w:r>
+        <w:t>nm_pessoa</w:t>
+      </w:r>
+      <w:r>
+        <w:t xml:space="preserve"> – </w:t>
+      </w:r>
+      <w:r>
+        <w:t>VARCHAR</w:t>
+      </w:r>
+      <w:r>
+        <w:t>(</w:t>
+      </w:r>
+      <w:r>
+        <w:t>150</w:t>
+      </w:r>
+      <w:r>
+        <w:t>)</w:t>
+      </w:r>
+    </w:p>
+    <w:p>
+      <w:r>
+        <w:t>· nr_cpf - CHAR(11)</w:t>
+      </w:r>
+    </w:p>
+    <w:p>
+      <w:r>
+        <w:t>· dt_nascimento - DATE</w:t>
+      </w:r>
+    </w:p>
+    <w:p>
+      <w:r>
+        <w:t>· ds_email - VARCHAR(255)</w:t>
+      </w:r>
+    </w:p>
+    <w:p>
+      <w:r>
+        <w:t>· nr_telefone - VARCHAR(11)</w:t>
+      </w:r>
+    </w:p>
+    <w:p>
+      <w:r>
+        <w:t>· st_pessoa - ENUM('ATIVA', 'INATIVA')</w:t>
+      </w:r>
+    </w:p>
+    <w:p/>
+    <w:p>
+      <w:r>
+        <w:rPr>
+          <w:b/>
+          <w:bCs/>
+        </w:rPr>
+        <w:t>Endereço</w:t>
+      </w:r>
+    </w:p>
+    <w:p>
+      <w:r>
+        <w:t>· id_endereco - INT</w:t>
+      </w:r>
+    </w:p>
+    <w:p>
+      <w:r>
         <w:t>· id_pessoa - INT</w:t>
       </w:r>
     </w:p>
     <w:p>
       <w:r>
-        <w:t>· nr_cpf - CHAR(11)</w:t>
-      </w:r>
-    </w:p>
-    <w:p>
-      <w:r>
-        <w:t>· dt_nascimento - DATE</w:t>
-      </w:r>
-    </w:p>
-    <w:p>
-      <w:r>
-        <w:t>· ds_email - VARCHAR(255)</w:t>
-      </w:r>
-    </w:p>
-    <w:p>
-      <w:r>
-        <w:t>· nr_telefone - VARCHAR(11)</w:t>
-      </w:r>
-    </w:p>
-    <w:p>
-      <w:r>
-        <w:t>· st_pessoa - ENUM('ATIVA', 'INATIVA')</w:t>
+        <w:t>· nr_cep - CHAR(8)</w:t>
+      </w:r>
+    </w:p>
+    <w:p>
+      <w:r>
+        <w:t>· ds_logradouro - VARCHAR(255)</w:t>
+      </w:r>
+    </w:p>
+    <w:p>
+      <w:r>
+        <w:t>· nr_imovel - VARCHAR(10)</w:t>
+      </w:r>
+    </w:p>
+    <w:p>
+      <w:r>
+        <w:t>· ds_complemento - VARCHAR(100)</w:t>
+      </w:r>
+    </w:p>
+    <w:p>
+      <w:r>
+        <w:lastRenderedPageBreak/>
+        <w:t>· ds_bairro - VARCHAR(100)</w:t>
+      </w:r>
+    </w:p>
+    <w:p>
+      <w:r>
+        <w:t>· ds_municipio - VARCHAR(100)</w:t>
+      </w:r>
+    </w:p>
+    <w:p>
+      <w:r>
+        <w:t>· sg_uf - CHAR(2)</w:t>
       </w:r>
     </w:p>
     <w:p/>
@@ -4234,53 +4325,504 @@
           <w:b/>
           <w:bCs/>
         </w:rPr>
+        <w:t>Papel</w:t>
+      </w:r>
+    </w:p>
+    <w:p>
+      <w:r>
+        <w:t>· id_papel - INT</w:t>
+      </w:r>
+    </w:p>
+    <w:p>
+      <w:r>
+        <w:t>· nm_papel - VARCHAR(20)</w:t>
+      </w:r>
+    </w:p>
+    <w:p/>
+    <w:p>
+      <w:r>
+        <w:rPr>
+          <w:b/>
+          <w:bCs/>
+        </w:rPr>
+        <w:t>Pessoa_Papel</w:t>
+      </w:r>
+    </w:p>
+    <w:p>
+      <w:r>
+        <w:t>· id_pessoa - INT</w:t>
+      </w:r>
+    </w:p>
+    <w:p>
+      <w:r>
+        <w:t xml:space="preserve">· id_papel </w:t>
+      </w:r>
+      <w:r>
+        <w:t>–</w:t>
+      </w:r>
+      <w:r>
+        <w:t xml:space="preserve"> INT</w:t>
+      </w:r>
+    </w:p>
+    <w:p/>
+    <w:p>
+      <w:r>
+        <w:rPr>
+          <w:b/>
+          <w:bCs/>
+        </w:rPr>
+        <w:t>Usuário Interno</w:t>
+      </w:r>
+    </w:p>
+    <w:p>
+      <w:r>
+        <w:t>· id_usuario - INT</w:t>
+      </w:r>
+    </w:p>
+    <w:p>
+      <w:r>
+        <w:t>· id_pessoa - INT</w:t>
+      </w:r>
+    </w:p>
+    <w:p>
+      <w:r>
+        <w:t>· nm_login - VARCHAR(100)</w:t>
+      </w:r>
+    </w:p>
+    <w:p>
+      <w:r>
+        <w:t>· nm_senha - VARCHAR(255)</w:t>
+      </w:r>
+    </w:p>
+    <w:p>
+      <w:r>
+        <w:t>· st_situacao_acesso - ENUM('ATIVO', 'INATIVO')</w:t>
+      </w:r>
+    </w:p>
+    <w:p/>
+    <w:p>
+      <w:r>
+        <w:rPr>
+          <w:b/>
+          <w:bCs/>
+        </w:rPr>
+        <w:t>Responsável</w:t>
+      </w:r>
+    </w:p>
+    <w:p>
+      <w:r>
+        <w:t>· id_responsavel - INT</w:t>
+      </w:r>
+    </w:p>
+    <w:p>
+      <w:r>
+        <w:t>· id_pessoa - INT</w:t>
+      </w:r>
+    </w:p>
+    <w:p>
+      <w:r>
+        <w:t>· ds_responsavel - VARCHAR(255)</w:t>
+      </w:r>
+    </w:p>
+    <w:p/>
+    <w:p>
+      <w:r>
+        <w:rPr>
+          <w:b/>
+          <w:bCs/>
+        </w:rPr>
+        <w:t>Evento</w:t>
+      </w:r>
+    </w:p>
+    <w:p>
+      <w:r>
+        <w:t>· id_evento - INT</w:t>
+      </w:r>
+    </w:p>
+    <w:p>
+      <w:r>
+        <w:t>· ds_titulo - VARCHAR(150)</w:t>
+      </w:r>
+    </w:p>
+    <w:p>
+      <w:r>
+        <w:t>· ds_evento - TEXT</w:t>
+      </w:r>
+    </w:p>
+    <w:p>
+      <w:r>
+        <w:lastRenderedPageBreak/>
+        <w:t>· tp_evento - ENUM('CURSO', 'OFICINA', 'PALESTRA')</w:t>
+      </w:r>
+    </w:p>
+    <w:p>
+      <w:r>
+        <w:t>· ds_local - VARCHAR(255)</w:t>
+      </w:r>
+    </w:p>
+    <w:p>
+      <w:r>
+        <w:t>· st_classificacao - ENUM('UNICO', 'RECORRENTE')</w:t>
+      </w:r>
+    </w:p>
+    <w:p>
+      <w:r>
+        <w:t>· st_frequencia - ENUM('DIARIA', 'SEMANAL', 'QUINZENAL', 'MENSAL')</w:t>
+      </w:r>
+    </w:p>
+    <w:p>
+      <w:r>
+        <w:t>· ds_modalidade_duracao - ENUM('QUANTIDADE_OCORRENCIAS', 'DATA_FINAL', 'SEM_PREVISAO_DE_FIM')</w:t>
+      </w:r>
+    </w:p>
+    <w:p>
+      <w:r>
+        <w:t>· nr_quantidade_total_ocorrencias - INT</w:t>
+      </w:r>
+    </w:p>
+    <w:p>
+      <w:r>
+        <w:t>· dt_final - DATE</w:t>
+      </w:r>
+    </w:p>
+    <w:p>
+      <w:r>
+        <w:t>· nr_capacidade - INT</w:t>
+      </w:r>
+    </w:p>
+    <w:p>
+      <w:r>
+        <w:t>· dt_hora_abertura_inscricao - DATETIME</w:t>
+      </w:r>
+    </w:p>
+    <w:p>
+      <w:r>
+        <w:t>· dt_hora_encerramento_inscricao - DATETIME</w:t>
+      </w:r>
+    </w:p>
+    <w:p>
+      <w:r>
+        <w:t>· nr_limite_faltas_consecutivas - INT</w:t>
+      </w:r>
+    </w:p>
+    <w:p>
+      <w:r>
+        <w:t>· st_estado_evento - ENUM('PROGRAMADO', 'REALIZADO', 'CANCELADO')</w:t>
+      </w:r>
+    </w:p>
+    <w:p>
+      <w:r>
+        <w:t>· st_visibilidade - ENUM('OCULTO', 'PUBLICADO')</w:t>
+      </w:r>
+    </w:p>
+    <w:p>
+      <w:r>
+        <w:t>· ds_motivo_cancelamento - VARCHAR(255)</w:t>
+      </w:r>
+    </w:p>
+    <w:p/>
+    <w:p>
+      <w:r>
+        <w:rPr>
+          <w:b/>
+          <w:bCs/>
+        </w:rPr>
+        <w:t>Evento_Responsavel</w:t>
+      </w:r>
+    </w:p>
+    <w:p>
+      <w:r>
+        <w:t>· id_evento - INT</w:t>
+      </w:r>
+    </w:p>
+    <w:p>
+      <w:r>
+        <w:t>· id_responsavel - INT</w:t>
+      </w:r>
+    </w:p>
+    <w:p/>
+    <w:p>
+      <w:r>
+        <w:rPr>
+          <w:b/>
+          <w:bCs/>
+        </w:rPr>
+        <w:t>Ocorrência</w:t>
+      </w:r>
+    </w:p>
+    <w:p>
+      <w:r>
+        <w:t>· id_ocorrencia - INT</w:t>
+      </w:r>
+    </w:p>
+    <w:p>
+      <w:r>
+        <w:t>· id_evento - INT</w:t>
+      </w:r>
+    </w:p>
+    <w:p>
+      <w:r>
+        <w:t>· dt_hora_inicio - DATETIME</w:t>
+      </w:r>
+    </w:p>
+    <w:p>
+      <w:r>
+        <w:t>· dt_hora_fim - DATETIME</w:t>
+      </w:r>
+    </w:p>
+    <w:p>
+      <w:r>
+        <w:t>· st_cancelada - BOOLEAN</w:t>
+      </w:r>
+    </w:p>
+    <w:p>
+      <w:r>
+        <w:t>· st_lista_presenca_finalizada - BOOLEAN</w:t>
+      </w:r>
+    </w:p>
+    <w:p/>
+    <w:p>
+      <w:r>
+        <w:rPr>
+          <w:b/>
+          <w:bCs/>
+        </w:rPr>
+        <w:lastRenderedPageBreak/>
+        <w:t>Inscrição</w:t>
+      </w:r>
+    </w:p>
+    <w:p>
+      <w:r>
+        <w:t>· id_inscricao - INT</w:t>
+      </w:r>
+    </w:p>
+    <w:p>
+      <w:r>
+        <w:t>· id_pessoa - INT</w:t>
+      </w:r>
+    </w:p>
+    <w:p>
+      <w:r>
+        <w:t>· id_evento - INT</w:t>
+      </w:r>
+    </w:p>
+    <w:p>
+      <w:r>
+        <w:t>· cd_inscricao - VARCHAR(50)</w:t>
+      </w:r>
+    </w:p>
+    <w:p>
+      <w:r>
+        <w:t>· st_estado - ENUM('CONFIRMADA', 'INVALIDADA_POR_INATIVACAO', 'CANCELADA_POR_EVENTO', 'CANCELADA_A_PEDIDO', 'ENCERRADA_POR_FALTAS')</w:t>
+      </w:r>
+    </w:p>
+    <w:p>
+      <w:r>
+        <w:t>· ds_motivo_cancelamento - VARCHAR(255)</w:t>
+      </w:r>
+    </w:p>
+    <w:p>
+      <w:r>
+        <w:t>· nr_faltas_consecutivas - INT</w:t>
+      </w:r>
+    </w:p>
+    <w:p/>
+    <w:p>
+      <w:r>
+        <w:rPr>
+          <w:b/>
+          <w:bCs/>
+        </w:rPr>
+        <w:t>Presença</w:t>
+      </w:r>
+    </w:p>
+    <w:p>
+      <w:r>
+        <w:t>· id_presenca - INT</w:t>
+      </w:r>
+    </w:p>
+    <w:p>
+      <w:r>
+        <w:t>· id_inscricao - INT</w:t>
+      </w:r>
+    </w:p>
+    <w:p>
+      <w:r>
+        <w:t>· id_ocorrencia - INT</w:t>
+      </w:r>
+    </w:p>
+    <w:p>
+      <w:r>
+        <w:t>· st_situacao_presenca - ENUM('PRESENTE', 'FALTA')</w:t>
+      </w:r>
+    </w:p>
+    <w:p/>
+    <w:p>
+      <w:pPr>
+        <w:pStyle w:val="Subttulo"/>
+      </w:pPr>
+      <w:r>
+        <w:t>Chaves primarias e estrangeiras</w:t>
+      </w:r>
+    </w:p>
+    <w:p>
+      <w:pPr>
+        <w:rPr>
+          <w:b/>
+          <w:bCs/>
+        </w:rPr>
+      </w:pPr>
+      <w:r>
+        <w:rPr>
+          <w:b/>
+          <w:bCs/>
+        </w:rPr>
+        <w:t>Pessoa</w:t>
+      </w:r>
+    </w:p>
+    <w:p>
+      <w:r>
+        <w:rPr>
+          <w:b/>
+          <w:bCs/>
+        </w:rPr>
+        <w:t>Chave Primária</w:t>
+      </w:r>
+    </w:p>
+    <w:p>
+      <w:r>
+        <w:t xml:space="preserve">· id_pessoa - </w:t>
+      </w:r>
+      <w:r>
+        <w:rPr>
+          <w:b/>
+          <w:bCs/>
+        </w:rPr>
+        <w:t>(PK)</w:t>
+      </w:r>
+      <w:r>
+        <w:t xml:space="preserve"> Chave primária da entidade Pessoa. Identifica de forma única cada pessoa cadastrada no banco de dados.</w:t>
+      </w:r>
+    </w:p>
+    <w:p>
+      <w:pPr>
+        <w:rPr>
+          <w:b/>
+          <w:bCs/>
+        </w:rPr>
+      </w:pPr>
+    </w:p>
+    <w:p>
+      <w:r>
+        <w:rPr>
+          <w:b/>
+          <w:bCs/>
+        </w:rPr>
         <w:t>Endereço</w:t>
       </w:r>
     </w:p>
     <w:p>
-      <w:r>
-        <w:t>· id_endereco - INT</w:t>
-      </w:r>
-    </w:p>
-    <w:p>
-      <w:r>
-        <w:t>· id_pessoa - INT</w:t>
-      </w:r>
-    </w:p>
-    <w:p>
-      <w:r>
-        <w:t>· nr_cep - CHAR(8)</w:t>
-      </w:r>
-    </w:p>
-    <w:p>
-      <w:r>
-        <w:t>· ds_logradouro - VARCHAR(255)</w:t>
-      </w:r>
-    </w:p>
-    <w:p>
-      <w:r>
-        <w:t>· nr_imovel - VARCHAR(10)</w:t>
-      </w:r>
-    </w:p>
-    <w:p>
-      <w:r>
-        <w:t>· ds_complemento - VARCHAR(100)</w:t>
-      </w:r>
-    </w:p>
-    <w:p>
-      <w:r>
-        <w:t>· ds_bairro - VARCHAR(100)</w:t>
+      <w:pPr>
+        <w:rPr>
+          <w:b/>
+          <w:bCs/>
+        </w:rPr>
+      </w:pPr>
+      <w:r>
+        <w:rPr>
+          <w:b/>
+          <w:bCs/>
+        </w:rPr>
+        <w:t>Chave Primária</w:t>
+      </w:r>
+    </w:p>
+    <w:p>
+      <w:r>
+        <w:t xml:space="preserve">· id_endereco - </w:t>
+      </w:r>
+      <w:r>
+        <w:rPr>
+          <w:b/>
+          <w:bCs/>
+        </w:rPr>
+        <w:t>(PK)</w:t>
+      </w:r>
+      <w:r>
+        <w:t xml:space="preserve"> Chave primária da entidade Endereço. Identifica de forma única cada registro de endereço armazenado no banco de dados.</w:t>
+      </w:r>
+    </w:p>
+    <w:p>
+      <w:r>
+        <w:rPr>
+          <w:b/>
+          <w:bCs/>
+        </w:rPr>
+        <w:t>Chave Estrangeira</w:t>
       </w:r>
     </w:p>
     <w:p>
       <w:r>
         <w:lastRenderedPageBreak/>
-        <w:t>· ds_municipio - VARCHAR(100)</w:t>
-      </w:r>
-    </w:p>
-    <w:p>
-      <w:r>
-        <w:t>· sg_uf - CHAR(2)</w:t>
+        <w:t xml:space="preserve">· id_pessoa - </w:t>
+      </w:r>
+      <w:r>
+        <w:rPr>
+          <w:b/>
+          <w:bCs/>
+        </w:rPr>
+        <w:t>(FK)</w:t>
+      </w:r>
+      <w:r>
+        <w:t xml:space="preserve"> Chave estrangeira que referência o campo id_pessoa da entidade </w:t>
+      </w:r>
+      <w:r>
+        <w:rPr>
+          <w:b/>
+          <w:bCs/>
+        </w:rPr>
+        <w:t>Pessoa</w:t>
+      </w:r>
+      <w:r>
+        <w:t>. Esse campo associa o endereço ao cadastro da pessoa correspondente.</w:t>
+      </w:r>
+    </w:p>
+    <w:p>
+      <w:pPr>
+        <w:rPr>
+          <w:b/>
+          <w:bCs/>
+        </w:rPr>
+      </w:pPr>
+      <w:r>
+        <w:rPr>
+          <w:b/>
+          <w:bCs/>
+        </w:rPr>
+        <w:t>Papel</w:t>
+      </w:r>
+    </w:p>
+    <w:p>
+      <w:r>
+        <w:rPr>
+          <w:b/>
+          <w:bCs/>
+        </w:rPr>
+        <w:t>Chave Primária</w:t>
+      </w:r>
+    </w:p>
+    <w:p>
+      <w:r>
+        <w:t xml:space="preserve">· id_papel - </w:t>
+      </w:r>
+      <w:r>
+        <w:rPr>
+          <w:b/>
+          <w:bCs/>
+        </w:rPr>
+        <w:t>(PK)</w:t>
+      </w:r>
+      <w:r>
+        <w:t xml:space="preserve"> Chave primária da entidade Papel. Identifica de forma única cada papel existente no sistema.</w:t>
       </w:r>
     </w:p>
     <w:p/>
@@ -4290,17 +4832,148 @@
           <w:b/>
           <w:bCs/>
         </w:rPr>
+        <w:t>Pessoa_Papel</w:t>
+      </w:r>
+    </w:p>
+    <w:p>
+      <w:r>
+        <w:rPr>
+          <w:b/>
+          <w:bCs/>
+        </w:rPr>
+        <w:t>Chave Primária</w:t>
+      </w:r>
+    </w:p>
+    <w:p>
+      <w:r>
+        <w:t xml:space="preserve">A entidade </w:t>
+      </w:r>
+      <w:r>
+        <w:rPr>
+          <w:b/>
+          <w:bCs/>
+        </w:rPr>
+        <w:t>Pessoa_Papel</w:t>
+      </w:r>
+      <w:r>
+        <w:t xml:space="preserve"> utiliza uma </w:t>
+      </w:r>
+      <w:r>
+        <w:rPr>
+          <w:b/>
+          <w:bCs/>
+        </w:rPr>
+        <w:t>chave primária composta</w:t>
+      </w:r>
+      <w:r>
+        <w:t>, formada pela combinação dos campos id_pessoa e id_papel.</w:t>
+      </w:r>
+    </w:p>
+    <w:p>
+      <w:r>
+        <w:t xml:space="preserve">· id_pessoa - </w:t>
+      </w:r>
+      <w:r>
+        <w:rPr>
+          <w:b/>
+          <w:bCs/>
+        </w:rPr>
+        <w:t>(PK, FK)</w:t>
+      </w:r>
+      <w:r>
+        <w:t xml:space="preserve"> Parte da chave primária composta e chave estrangeira que </w:t>
+      </w:r>
+      <w:r>
+        <w:t>referência</w:t>
+      </w:r>
+      <w:r>
+        <w:t xml:space="preserve"> a entidade </w:t>
+      </w:r>
+      <w:r>
+        <w:rPr>
+          <w:b/>
+          <w:bCs/>
+        </w:rPr>
+        <w:t>Pessoa</w:t>
+      </w:r>
+      <w:r>
+        <w:t>.</w:t>
+      </w:r>
+    </w:p>
+    <w:p>
+      <w:r>
+        <w:t xml:space="preserve">· id_papel - </w:t>
+      </w:r>
+      <w:r>
+        <w:rPr>
+          <w:b/>
+          <w:bCs/>
+        </w:rPr>
+        <w:t>(PK, FK)</w:t>
+      </w:r>
+      <w:r>
+        <w:t xml:space="preserve"> Parte da chave primária composta e chave estrangeira que </w:t>
+      </w:r>
+      <w:r>
+        <w:t>referência</w:t>
+      </w:r>
+      <w:r>
+        <w:t xml:space="preserve"> a entidade </w:t>
+      </w:r>
+      <w:r>
+        <w:rPr>
+          <w:b/>
+          <w:bCs/>
+        </w:rPr>
         <w:t>Papel</w:t>
       </w:r>
-    </w:p>
-    <w:p>
-      <w:r>
-        <w:t>· id_papel - INT</w:t>
-      </w:r>
-    </w:p>
-    <w:p>
-      <w:r>
-        <w:t>· nm_papel - VARCHAR(20)</w:t>
+      <w:r>
+        <w:t>.</w:t>
+      </w:r>
+    </w:p>
+    <w:p>
+      <w:pPr>
+        <w:rPr>
+          <w:b/>
+          <w:bCs/>
+        </w:rPr>
+      </w:pPr>
+      <w:r>
+        <w:rPr>
+          <w:b/>
+          <w:bCs/>
+        </w:rPr>
+        <w:t>Chaves Estrangeiras</w:t>
+      </w:r>
+    </w:p>
+    <w:p>
+      <w:r>
+        <w:t xml:space="preserve">· id_pessoa - </w:t>
+      </w:r>
+      <w:r>
+        <w:rPr>
+          <w:b/>
+          <w:bCs/>
+        </w:rPr>
+        <w:t>(FK)</w:t>
+      </w:r>
+      <w:r>
+        <w:t xml:space="preserve"> Referência Pessoa.id_pessoa, identificando a pessoa à qual o papel foi atribuído.</w:t>
+      </w:r>
+    </w:p>
+    <w:p>
+      <w:r>
+        <w:t xml:space="preserve">· id_papel - </w:t>
+      </w:r>
+      <w:r>
+        <w:rPr>
+          <w:b/>
+          <w:bCs/>
+        </w:rPr>
+        <w:t>(FK)</w:t>
+      </w:r>
+      <w:r>
+        <w:t xml:space="preserve"> Referência Papel.id_papel, identificando o papel atribuído à pessoa.</w:t>
       </w:r>
     </w:p>
     <w:p/>
@@ -4310,23 +4983,71 @@
           <w:b/>
           <w:bCs/>
         </w:rPr>
-        <w:t>Pessoa_Papel</w:t>
-      </w:r>
-    </w:p>
-    <w:p>
-      <w:r>
-        <w:t>· id_pessoa - INT</w:t>
-      </w:r>
-    </w:p>
-    <w:p>
-      <w:r>
-        <w:t xml:space="preserve">· id_papel </w:t>
-      </w:r>
-      <w:r>
-        <w:t>–</w:t>
-      </w:r>
-      <w:r>
-        <w:t xml:space="preserve"> INT</w:t>
+        <w:t>Usuário Interno</w:t>
+      </w:r>
+    </w:p>
+    <w:p>
+      <w:r>
+        <w:rPr>
+          <w:b/>
+          <w:bCs/>
+        </w:rPr>
+        <w:t>Chave Primária</w:t>
+      </w:r>
+    </w:p>
+    <w:p>
+      <w:r>
+        <w:t xml:space="preserve">· id_usuario - </w:t>
+      </w:r>
+      <w:r>
+        <w:rPr>
+          <w:b/>
+          <w:bCs/>
+        </w:rPr>
+        <w:t>(PK)</w:t>
+      </w:r>
+      <w:r>
+        <w:t xml:space="preserve"> Chave primária da entidade Usuário Interno. Identifica de forma única cada conta de acesso ao painel interno do sistema.</w:t>
+      </w:r>
+    </w:p>
+    <w:p>
+      <w:pPr>
+        <w:rPr>
+          <w:b/>
+          <w:bCs/>
+        </w:rPr>
+      </w:pPr>
+      <w:r>
+        <w:rPr>
+          <w:b/>
+          <w:bCs/>
+        </w:rPr>
+        <w:t>Chave Estrangeira</w:t>
+      </w:r>
+    </w:p>
+    <w:p>
+      <w:r>
+        <w:t xml:space="preserve">· id_pessoa - </w:t>
+      </w:r>
+      <w:r>
+        <w:rPr>
+          <w:b/>
+          <w:bCs/>
+        </w:rPr>
+        <w:t>(FK)</w:t>
+      </w:r>
+      <w:r>
+        <w:t xml:space="preserve"> Chave estrangeira que referência o campo id_pessoa da entidade </w:t>
+      </w:r>
+      <w:r>
+        <w:rPr>
+          <w:b/>
+          <w:bCs/>
+        </w:rPr>
+        <w:t>Pessoa</w:t>
+      </w:r>
+      <w:r>
+        <w:t>. Esse campo associa a conta de usuário interno ao cadastro único da pessoa correspondente.</w:t>
       </w:r>
     </w:p>
     <w:p/>
@@ -4336,32 +5057,78 @@
           <w:b/>
           <w:bCs/>
         </w:rPr>
-        <w:t>Usuário Interno</w:t>
-      </w:r>
-    </w:p>
-    <w:p>
-      <w:r>
-        <w:t>· id_usuario - INT</w:t>
-      </w:r>
-    </w:p>
-    <w:p>
-      <w:r>
-        <w:t>· id_pessoa - INT</w:t>
-      </w:r>
-    </w:p>
-    <w:p>
-      <w:r>
-        <w:t>· nm_login - VARCHAR(100)</w:t>
-      </w:r>
-    </w:p>
-    <w:p>
-      <w:r>
-        <w:t>· nm_senha - VARCHAR(255)</w:t>
-      </w:r>
-    </w:p>
-    <w:p>
-      <w:r>
-        <w:t>· st_situacao_acesso - ENUM('ATIVO', 'INATIVO')</w:t>
+        <w:lastRenderedPageBreak/>
+        <w:t>Responsável</w:t>
+      </w:r>
+    </w:p>
+    <w:p>
+      <w:r>
+        <w:rPr>
+          <w:b/>
+          <w:bCs/>
+        </w:rPr>
+        <w:t>Chave Primária</w:t>
+      </w:r>
+    </w:p>
+    <w:p>
+      <w:r>
+        <w:t xml:space="preserve">· id_responsavel - </w:t>
+      </w:r>
+      <w:r>
+        <w:rPr>
+          <w:b/>
+          <w:bCs/>
+        </w:rPr>
+        <w:t>(PK)</w:t>
+      </w:r>
+      <w:r>
+        <w:t xml:space="preserve"> Chave primária da entidade Responsável. Identifica de forma única cada registro de responsável armazenado no banco de dados.</w:t>
+      </w:r>
+    </w:p>
+    <w:p>
+      <w:pPr>
+        <w:rPr>
+          <w:b/>
+          <w:bCs/>
+        </w:rPr>
+      </w:pPr>
+      <w:r>
+        <w:rPr>
+          <w:b/>
+          <w:bCs/>
+        </w:rPr>
+        <w:t>Chave Estrangeira</w:t>
+      </w:r>
+    </w:p>
+    <w:p>
+      <w:r>
+        <w:t xml:space="preserve">· id_pessoa - </w:t>
+      </w:r>
+      <w:r>
+        <w:rPr>
+          <w:b/>
+          <w:bCs/>
+        </w:rPr>
+        <w:t>(FK)</w:t>
+      </w:r>
+      <w:r>
+        <w:t xml:space="preserve"> Chave estrangeira que </w:t>
+      </w:r>
+      <w:r>
+        <w:t>referência</w:t>
+      </w:r>
+      <w:r>
+        <w:t xml:space="preserve"> o campo id_pessoa da entidade </w:t>
+      </w:r>
+      <w:r>
+        <w:rPr>
+          <w:b/>
+          <w:bCs/>
+        </w:rPr>
+        <w:t>Pessoa</w:t>
+      </w:r>
+      <w:r>
+        <w:t>. Esse campo associa o registro de responsável ao cadastro único da pessoa correspondente.</w:t>
       </w:r>
     </w:p>
     <w:p/>
@@ -4371,26 +5138,237 @@
           <w:b/>
           <w:bCs/>
         </w:rPr>
+        <w:t>Evento</w:t>
+      </w:r>
+    </w:p>
+    <w:p>
+      <w:r>
+        <w:rPr>
+          <w:b/>
+          <w:bCs/>
+        </w:rPr>
+        <w:t>Chave Primária</w:t>
+      </w:r>
+    </w:p>
+    <w:p>
+      <w:r>
+        <w:t xml:space="preserve">· id_evento - </w:t>
+      </w:r>
+      <w:r>
+        <w:rPr>
+          <w:b/>
+          <w:bCs/>
+        </w:rPr>
+        <w:t>(PK)</w:t>
+      </w:r>
+      <w:r>
+        <w:t xml:space="preserve"> Chave primária da entidade Evento. Identifica de forma única cada evento cadastrado no banco de dados.</w:t>
+      </w:r>
+    </w:p>
+    <w:p/>
+    <w:p>
+      <w:r>
+        <w:rPr>
+          <w:b/>
+          <w:bCs/>
+        </w:rPr>
+        <w:t>Evento_Responsavel</w:t>
+      </w:r>
+    </w:p>
+    <w:p>
+      <w:r>
+        <w:rPr>
+          <w:b/>
+          <w:bCs/>
+        </w:rPr>
+        <w:t>Chave Primária</w:t>
+      </w:r>
+    </w:p>
+    <w:p>
+      <w:r>
+        <w:t xml:space="preserve">A entidade </w:t>
+      </w:r>
+      <w:r>
+        <w:rPr>
+          <w:b/>
+          <w:bCs/>
+        </w:rPr>
+        <w:t>Evento_Responsavel</w:t>
+      </w:r>
+      <w:r>
+        <w:t xml:space="preserve"> utiliza uma </w:t>
+      </w:r>
+      <w:r>
+        <w:rPr>
+          <w:b/>
+          <w:bCs/>
+        </w:rPr>
+        <w:t>chave primária composta</w:t>
+      </w:r>
+      <w:r>
+        <w:t>, formada pela combinação dos campos id_evento e id_responsavel.</w:t>
+      </w:r>
+    </w:p>
+    <w:p>
+      <w:r>
+        <w:t xml:space="preserve">· id_evento - </w:t>
+      </w:r>
+      <w:r>
+        <w:rPr>
+          <w:b/>
+          <w:bCs/>
+        </w:rPr>
+        <w:t>(PK, FK)</w:t>
+      </w:r>
+      <w:r>
+        <w:t xml:space="preserve"> Parte da chave primária composta e chave estrangeira que referência a entidade </w:t>
+      </w:r>
+      <w:r>
+        <w:rPr>
+          <w:b/>
+          <w:bCs/>
+        </w:rPr>
+        <w:t>Evento</w:t>
+      </w:r>
+      <w:r>
+        <w:t>.</w:t>
+      </w:r>
+    </w:p>
+    <w:p>
+      <w:r>
+        <w:t xml:space="preserve">· id_responsavel - </w:t>
+      </w:r>
+      <w:r>
+        <w:rPr>
+          <w:b/>
+          <w:bCs/>
+        </w:rPr>
+        <w:t>(PK, FK)</w:t>
+      </w:r>
+      <w:r>
+        <w:t xml:space="preserve"> Parte da chave primária composta e chave estrangeira que referência a entidade </w:t>
+      </w:r>
+      <w:r>
+        <w:rPr>
+          <w:b/>
+          <w:bCs/>
+        </w:rPr>
         <w:t>Responsável</w:t>
       </w:r>
-    </w:p>
-    <w:p>
-      <w:r>
-        <w:t>· id_responsavel - INT</w:t>
-      </w:r>
-    </w:p>
-    <w:p>
-      <w:r>
-        <w:t>· id_pessoa - INT</w:t>
-      </w:r>
-    </w:p>
-    <w:p>
-      <w:r>
-        <w:t>· ds_responsavel - VARCHAR(255)</w:t>
+      <w:r>
+        <w:t>.</w:t>
       </w:r>
     </w:p>
     <w:p/>
     <w:p>
+      <w:pPr>
+        <w:rPr>
+          <w:b/>
+          <w:bCs/>
+        </w:rPr>
+      </w:pPr>
+      <w:r>
+        <w:rPr>
+          <w:b/>
+          <w:bCs/>
+        </w:rPr>
+        <w:t>Chaves Estrangeiras</w:t>
+      </w:r>
+    </w:p>
+    <w:p>
+      <w:r>
+        <w:t xml:space="preserve">· id_evento - </w:t>
+      </w:r>
+      <w:r>
+        <w:rPr>
+          <w:b/>
+          <w:bCs/>
+        </w:rPr>
+        <w:t>(FK)</w:t>
+      </w:r>
+      <w:r>
+        <w:t xml:space="preserve"> Referência Evento.id_evento, identificando o evento ao qual o responsável está vinculado.</w:t>
+      </w:r>
+    </w:p>
+    <w:p>
+      <w:r>
+        <w:t xml:space="preserve">· id_responsavel - </w:t>
+      </w:r>
+      <w:r>
+        <w:rPr>
+          <w:b/>
+          <w:bCs/>
+        </w:rPr>
+        <w:t>(FK)</w:t>
+      </w:r>
+      <w:r>
+        <w:t xml:space="preserve"> Referência Responsavel.id_responsavel, identificando o responsável associado ao evento.</w:t>
+      </w:r>
+    </w:p>
+    <w:p/>
+    <w:p>
+      <w:r>
+        <w:rPr>
+          <w:b/>
+          <w:bCs/>
+        </w:rPr>
+        <w:t>Ocorrência</w:t>
+      </w:r>
+    </w:p>
+    <w:p>
+      <w:r>
+        <w:rPr>
+          <w:b/>
+          <w:bCs/>
+        </w:rPr>
+        <w:t>Chave Primária</w:t>
+      </w:r>
+    </w:p>
+    <w:p>
+      <w:r>
+        <w:lastRenderedPageBreak/>
+        <w:t xml:space="preserve">· id_ocorrencia - </w:t>
+      </w:r>
+      <w:r>
+        <w:rPr>
+          <w:b/>
+          <w:bCs/>
+        </w:rPr>
+        <w:t>(PK)</w:t>
+      </w:r>
+      <w:r>
+        <w:t xml:space="preserve"> Chave primária da entidade Ocorrência. Identifica de forma única cada realização concreta de um evento no banco de dados.</w:t>
+      </w:r>
+    </w:p>
+    <w:p>
+      <w:pPr>
+        <w:rPr>
+          <w:b/>
+          <w:bCs/>
+        </w:rPr>
+      </w:pPr>
+      <w:r>
+        <w:rPr>
+          <w:b/>
+          <w:bCs/>
+        </w:rPr>
+        <w:t>Chave Estrangeira</w:t>
+      </w:r>
+    </w:p>
+    <w:p>
+      <w:r>
+        <w:t xml:space="preserve">· id_evento - </w:t>
+      </w:r>
+      <w:r>
+        <w:rPr>
+          <w:b/>
+          <w:bCs/>
+        </w:rPr>
+        <w:t>(FK)</w:t>
+      </w:r>
+      <w:r>
+        <w:t xml:space="preserve"> Chave estrangeira que referência o campo id_evento da entidade </w:t>
+      </w:r>
       <w:r>
         <w:rPr>
           <w:b/>
@@ -4398,1275 +5376,254 @@
         </w:rPr>
         <w:t>Evento</w:t>
       </w:r>
-    </w:p>
-    <w:p>
-      <w:r>
-        <w:t>· id_evento - INT</w:t>
-      </w:r>
-    </w:p>
-    <w:p>
-      <w:r>
-        <w:t>· ds_titulo - VARCHAR(150)</w:t>
-      </w:r>
-    </w:p>
-    <w:p>
-      <w:r>
-        <w:t>· ds_evento - TEXT</w:t>
-      </w:r>
-    </w:p>
-    <w:p>
-      <w:r>
-        <w:t>· tp_evento - ENUM('CURSO', 'OFICINA', 'PALESTRA')</w:t>
-      </w:r>
-    </w:p>
-    <w:p>
+      <w:r>
+        <w:t>. Esse campo identifica a qual evento a ocorrência pertence.</w:t>
+      </w:r>
+    </w:p>
+    <w:p/>
+    <w:p>
+      <w:r>
+        <w:rPr>
+          <w:b/>
+          <w:bCs/>
+        </w:rPr>
+        <w:t>Inscrição</w:t>
+      </w:r>
+    </w:p>
+    <w:p>
+      <w:r>
+        <w:t xml:space="preserve">Para a entidade </w:t>
+      </w:r>
+      <w:r>
+        <w:rPr>
+          <w:b/>
+          <w:bCs/>
+        </w:rPr>
+        <w:t>Inscrição</w:t>
+      </w:r>
+      <w:r>
+        <w:t>, a definição das chaves pode ser documentada da seguinte forma:</w:t>
+      </w:r>
+    </w:p>
+    <w:p>
+      <w:pPr>
+        <w:rPr>
+          <w:b/>
+          <w:bCs/>
+        </w:rPr>
+      </w:pPr>
+      <w:r>
+        <w:rPr>
+          <w:b/>
+          <w:bCs/>
+        </w:rPr>
+        <w:t>Inscrição</w:t>
+      </w:r>
+    </w:p>
+    <w:p>
+      <w:r>
+        <w:rPr>
+          <w:b/>
+          <w:bCs/>
+        </w:rPr>
+        <w:t>Chave Primária</w:t>
+      </w:r>
+    </w:p>
+    <w:p>
+      <w:r>
+        <w:t xml:space="preserve">· id_inscricao - </w:t>
+      </w:r>
+      <w:r>
+        <w:rPr>
+          <w:b/>
+          <w:bCs/>
+        </w:rPr>
+        <w:t>(PK)</w:t>
+      </w:r>
+      <w:r>
+        <w:t xml:space="preserve"> Chave primária da entidade Inscrição. Identifica de forma única cada registro de inscrição armazenado no banco de dados.</w:t>
+      </w:r>
+    </w:p>
+    <w:p>
+      <w:pPr>
+        <w:rPr>
+          <w:b/>
+          <w:bCs/>
+        </w:rPr>
+      </w:pPr>
+      <w:r>
+        <w:rPr>
+          <w:b/>
+          <w:bCs/>
+        </w:rPr>
+        <w:t>Chaves Estrangeiras</w:t>
+      </w:r>
+    </w:p>
+    <w:p>
+      <w:r>
+        <w:t xml:space="preserve">· id_pessoa - </w:t>
+      </w:r>
+      <w:r>
+        <w:rPr>
+          <w:b/>
+          <w:bCs/>
+        </w:rPr>
+        <w:t>(FK)</w:t>
+      </w:r>
+      <w:r>
+        <w:t xml:space="preserve"> Chave estrangeira que referência o campo id_pessoa da entidade </w:t>
+      </w:r>
+      <w:r>
+        <w:rPr>
+          <w:b/>
+          <w:bCs/>
+        </w:rPr>
+        <w:t>Pessoa</w:t>
+      </w:r>
+      <w:r>
+        <w:t>. Esse campo identifica a pessoa que realizou a inscrição.</w:t>
+      </w:r>
+    </w:p>
+    <w:p>
+      <w:r>
+        <w:t xml:space="preserve">· id_evento - </w:t>
+      </w:r>
+      <w:r>
+        <w:rPr>
+          <w:b/>
+          <w:bCs/>
+        </w:rPr>
+        <w:t>(FK)</w:t>
+      </w:r>
+      <w:r>
+        <w:t xml:space="preserve"> Chave estrangeira que referência o campo id_evento da entidade </w:t>
+      </w:r>
+      <w:r>
+        <w:rPr>
+          <w:b/>
+          <w:bCs/>
+        </w:rPr>
+        <w:t>Evento</w:t>
+      </w:r>
+      <w:r>
+        <w:t>. Esse campo identifica o evento no qual a pessoa está inscrita.</w:t>
+      </w:r>
+    </w:p>
+    <w:p/>
+    <w:p>
+      <w:r>
+        <w:rPr>
+          <w:b/>
+          <w:bCs/>
+        </w:rPr>
+        <w:t>Presença</w:t>
+      </w:r>
+    </w:p>
+    <w:p>
+      <w:r>
+        <w:rPr>
+          <w:b/>
+          <w:bCs/>
+        </w:rPr>
+        <w:t>Chave Primária</w:t>
+      </w:r>
+    </w:p>
+    <w:p>
+      <w:r>
+        <w:t xml:space="preserve">· id_presenca - </w:t>
+      </w:r>
+      <w:r>
+        <w:rPr>
+          <w:b/>
+          <w:bCs/>
+        </w:rPr>
+        <w:t>(PK)</w:t>
+      </w:r>
+      <w:r>
+        <w:t xml:space="preserve"> Chave primária da entidade Presença. Identifica de forma única cada registro de presença armazenado no banco de dados.</w:t>
+      </w:r>
+    </w:p>
+    <w:p>
+      <w:pPr>
+        <w:rPr>
+          <w:b/>
+          <w:bCs/>
+        </w:rPr>
+      </w:pPr>
+      <w:r>
+        <w:rPr>
+          <w:b/>
+          <w:bCs/>
+        </w:rPr>
+        <w:t>Chaves Estrangeiras</w:t>
+      </w:r>
+    </w:p>
+    <w:p>
+      <w:r>
+        <w:t xml:space="preserve">· id_inscricao - </w:t>
+      </w:r>
+      <w:r>
+        <w:rPr>
+          <w:b/>
+          <w:bCs/>
+        </w:rPr>
+        <w:t>(FK)</w:t>
+      </w:r>
+      <w:r>
+        <w:t xml:space="preserve"> Chave estrangeira que referência o campo id_inscricao da entidade </w:t>
+      </w:r>
+      <w:r>
+        <w:rPr>
+          <w:b/>
+          <w:bCs/>
+        </w:rPr>
+        <w:t>Inscrição</w:t>
+      </w:r>
+      <w:r>
+        <w:t>. Esse campo identifica a inscrição à qual o registro de presença pertence.</w:t>
+      </w:r>
+    </w:p>
+    <w:p>
+      <w:r>
+        <w:t xml:space="preserve">· id_ocorrencia - </w:t>
+      </w:r>
+      <w:r>
+        <w:rPr>
+          <w:b/>
+          <w:bCs/>
+        </w:rPr>
+        <w:t>(FK)</w:t>
+      </w:r>
+      <w:r>
+        <w:t xml:space="preserve"> Chave estrangeira que referência o campo id_ocorrencia da entidade </w:t>
+      </w:r>
+      <w:r>
+        <w:rPr>
+          <w:b/>
+          <w:bCs/>
+        </w:rPr>
+        <w:t>Ocorrência</w:t>
+      </w:r>
+      <w:r>
+        <w:t>. Esse campo identifica a ocorrência do evento na qual a presença ou falta foi registrada.</w:t>
+      </w:r>
+    </w:p>
+    <w:p/>
+    <w:p>
+      <w:pPr>
+        <w:pStyle w:val="Subttulo"/>
+      </w:pPr>
       <w:r>
         <w:lastRenderedPageBreak/>
-        <w:t>· ds_local - VARCHAR(255)</w:t>
-      </w:r>
-    </w:p>
-    <w:p>
-      <w:r>
-        <w:t>· st_classificacao - ENUM('UNICO', 'RECORRENTE')</w:t>
-      </w:r>
-    </w:p>
-    <w:p>
-      <w:r>
-        <w:t>· st_frequencia - ENUM('DIARIA', 'SEMANAL', 'QUINZENAL', 'MENSAL')</w:t>
-      </w:r>
-    </w:p>
-    <w:p>
-      <w:r>
-        <w:t>· ds_modalidade_duracao - ENUM('QUANTIDADE_OCORRENCIAS', 'DATA_FINAL', 'SEM_PREVISAO_DE_FIM')</w:t>
-      </w:r>
-    </w:p>
-    <w:p>
-      <w:r>
-        <w:t>· nr_quantidade_total_ocorrencias - INT</w:t>
-      </w:r>
-    </w:p>
-    <w:p>
-      <w:r>
-        <w:t>· dt_final - DATE</w:t>
-      </w:r>
-    </w:p>
-    <w:p>
-      <w:r>
-        <w:t>· nr_capacidade - INT</w:t>
-      </w:r>
-    </w:p>
-    <w:p>
-      <w:r>
-        <w:t>· dt_hora_abertura_inscricao - DATETIME</w:t>
-      </w:r>
-    </w:p>
-    <w:p>
-      <w:r>
-        <w:t>· dt_hora_encerramento_inscricao - DATETIME</w:t>
-      </w:r>
-    </w:p>
-    <w:p>
-      <w:r>
-        <w:t>· nr_limite_faltas_consecutivas - INT</w:t>
-      </w:r>
-    </w:p>
-    <w:p>
-      <w:r>
-        <w:t>· st_estado_evento - ENUM('PROGRAMADO', 'REALIZADO', 'CANCELADO')</w:t>
-      </w:r>
-    </w:p>
-    <w:p>
-      <w:r>
-        <w:t>· st_visibilidade - ENUM('OCULTO', 'PUBLICADO')</w:t>
-      </w:r>
-    </w:p>
-    <w:p>
-      <w:r>
-        <w:t>· ds_motivo_cancelamento - VARCHAR(255)</w:t>
+        <w:t>Diagrama entidade relacionamento</w:t>
       </w:r>
     </w:p>
     <w:p/>
     <w:p>
-      <w:r>
-        <w:rPr>
-          <w:b/>
-          <w:bCs/>
-        </w:rPr>
-        <w:t>Evento_Responsavel</w:t>
-      </w:r>
-    </w:p>
-    <w:p>
-      <w:r>
-        <w:t>· id_evento - INT</w:t>
-      </w:r>
-    </w:p>
-    <w:p>
-      <w:r>
-        <w:t>· id_responsavel - INT</w:t>
-      </w:r>
-    </w:p>
-    <w:p/>
-    <w:p>
-      <w:r>
-        <w:rPr>
-          <w:b/>
-          <w:bCs/>
-        </w:rPr>
-        <w:t>Ocorrência</w:t>
-      </w:r>
-    </w:p>
-    <w:p>
-      <w:r>
-        <w:t>· id_ocorrencia - INT</w:t>
-      </w:r>
-    </w:p>
-    <w:p>
-      <w:r>
-        <w:t>· id_evento - INT</w:t>
-      </w:r>
-    </w:p>
-    <w:p>
-      <w:r>
-        <w:t>· dt_hora_inicio - DATETIME</w:t>
-      </w:r>
-    </w:p>
-    <w:p>
-      <w:r>
-        <w:t>· dt_hora_fim - DATETIME</w:t>
-      </w:r>
-    </w:p>
-    <w:p>
-      <w:r>
-        <w:t>· st_cancelada - BOOLEAN</w:t>
-      </w:r>
-    </w:p>
-    <w:p>
-      <w:r>
-        <w:t>· st_lista_presenca_finalizada - BOOLEAN</w:t>
-      </w:r>
-    </w:p>
-    <w:p/>
-    <w:p>
-      <w:r>
-        <w:rPr>
-          <w:b/>
-          <w:bCs/>
-        </w:rPr>
-        <w:t>Inscrição</w:t>
-      </w:r>
-    </w:p>
-    <w:p>
-      <w:r>
-        <w:lastRenderedPageBreak/>
-        <w:t>· id_inscricao - INT</w:t>
-      </w:r>
-    </w:p>
-    <w:p>
-      <w:r>
-        <w:t>· id_pessoa - INT</w:t>
-      </w:r>
-    </w:p>
-    <w:p>
-      <w:r>
-        <w:t>· id_evento - INT</w:t>
-      </w:r>
-    </w:p>
-    <w:p>
-      <w:r>
-        <w:t>· cd_inscricao - VARCHAR(50)</w:t>
-      </w:r>
-    </w:p>
-    <w:p>
-      <w:r>
-        <w:t>· st_estado - ENUM('CONFIRMADA', 'INVALIDADA_POR_INATIVACAO', 'CANCELADA_POR_EVENTO', 'CANCELADA_A_PEDIDO', 'ENCERRADA_POR_FALTAS')</w:t>
-      </w:r>
-    </w:p>
-    <w:p>
-      <w:r>
-        <w:t>· ds_motivo_cancelamento - VARCHAR(255)</w:t>
-      </w:r>
-    </w:p>
-    <w:p>
-      <w:r>
-        <w:t>· nr_faltas_consecutivas - INT</w:t>
-      </w:r>
-    </w:p>
-    <w:p/>
-    <w:p>
-      <w:r>
-        <w:rPr>
-          <w:b/>
-          <w:bCs/>
-        </w:rPr>
-        <w:t>Presença</w:t>
-      </w:r>
-    </w:p>
-    <w:p>
-      <w:r>
-        <w:t>· id_presenca - INT</w:t>
-      </w:r>
-    </w:p>
-    <w:p>
-      <w:r>
-        <w:t>· id_inscricao - INT</w:t>
-      </w:r>
-    </w:p>
-    <w:p>
-      <w:r>
-        <w:t>· id_ocorrencia - INT</w:t>
-      </w:r>
-    </w:p>
-    <w:p>
-      <w:r>
-        <w:t>· st_situacao_presenca - ENUM('PRESENTE', 'FALTA')</w:t>
-      </w:r>
-    </w:p>
-    <w:p/>
-    <w:p>
       <w:pPr>
         <w:pStyle w:val="Subttulo"/>
       </w:pPr>
       <w:r>
-        <w:t>Chaves primarias e estrangeiras</w:t>
-      </w:r>
-    </w:p>
-    <w:p>
-      <w:pPr>
-        <w:rPr>
-          <w:b/>
-          <w:bCs/>
-        </w:rPr>
-      </w:pPr>
-      <w:r>
-        <w:rPr>
-          <w:b/>
-          <w:bCs/>
-        </w:rPr>
-        <w:t>Pessoa</w:t>
-      </w:r>
-    </w:p>
-    <w:p>
-      <w:r>
-        <w:rPr>
-          <w:b/>
-          <w:bCs/>
-        </w:rPr>
-        <w:t>Chave Primária</w:t>
-      </w:r>
-    </w:p>
-    <w:p>
-      <w:r>
-        <w:t xml:space="preserve">· id_pessoa - </w:t>
-      </w:r>
-      <w:r>
-        <w:rPr>
-          <w:b/>
-          <w:bCs/>
-        </w:rPr>
-        <w:t>(PK)</w:t>
-      </w:r>
-      <w:r>
-        <w:t xml:space="preserve"> Chave primária da entidade Pessoa. Identifica de forma única cada pessoa cadastrada no banco de dados.</w:t>
-      </w:r>
-    </w:p>
-    <w:p>
-      <w:pPr>
-        <w:rPr>
-          <w:b/>
-          <w:bCs/>
-        </w:rPr>
-      </w:pPr>
-    </w:p>
-    <w:p>
-      <w:r>
-        <w:rPr>
-          <w:b/>
-          <w:bCs/>
-        </w:rPr>
-        <w:t>Endereço</w:t>
-      </w:r>
-    </w:p>
-    <w:p>
-      <w:pPr>
-        <w:rPr>
-          <w:b/>
-          <w:bCs/>
-        </w:rPr>
-      </w:pPr>
-      <w:r>
-        <w:rPr>
-          <w:b/>
-          <w:bCs/>
-        </w:rPr>
-        <w:t>Chave Primária</w:t>
-      </w:r>
-    </w:p>
-    <w:p>
-      <w:r>
-        <w:t xml:space="preserve">· id_endereco - </w:t>
-      </w:r>
-      <w:r>
-        <w:rPr>
-          <w:b/>
-          <w:bCs/>
-        </w:rPr>
-        <w:t>(PK)</w:t>
-      </w:r>
-      <w:r>
-        <w:t xml:space="preserve"> Chave primária da entidade Endereço. Identifica de forma única cada registro de endereço armazenado no banco de dados.</w:t>
-      </w:r>
-    </w:p>
-    <w:p>
-      <w:r>
-        <w:rPr>
-          <w:b/>
-          <w:bCs/>
-        </w:rPr>
-        <w:t>Chave Estrangeira</w:t>
-      </w:r>
-    </w:p>
-    <w:p>
-      <w:r>
-        <w:t xml:space="preserve">· id_pessoa - </w:t>
-      </w:r>
-      <w:r>
-        <w:rPr>
-          <w:b/>
-          <w:bCs/>
-        </w:rPr>
-        <w:t>(FK)</w:t>
-      </w:r>
-      <w:r>
-        <w:t xml:space="preserve"> Chave estrangeira que </w:t>
-      </w:r>
-      <w:r>
-        <w:t>referência</w:t>
-      </w:r>
-      <w:r>
-        <w:t xml:space="preserve"> o campo id_pessoa da entidade </w:t>
-      </w:r>
-      <w:r>
-        <w:rPr>
-          <w:b/>
-          <w:bCs/>
-        </w:rPr>
-        <w:t>Pessoa</w:t>
-      </w:r>
-      <w:r>
-        <w:t>. Esse campo associa o endereço ao cadastro da pessoa correspondente.</w:t>
-      </w:r>
-    </w:p>
-    <w:p>
-      <w:pPr>
-        <w:rPr>
-          <w:b/>
-          <w:bCs/>
-        </w:rPr>
-      </w:pPr>
-      <w:r>
-        <w:rPr>
-          <w:b/>
-          <w:bCs/>
-        </w:rPr>
-        <w:lastRenderedPageBreak/>
-        <w:t>Papel</w:t>
-      </w:r>
-    </w:p>
-    <w:p>
-      <w:r>
-        <w:rPr>
-          <w:b/>
-          <w:bCs/>
-        </w:rPr>
-        <w:t>Chave Primária</w:t>
-      </w:r>
-    </w:p>
-    <w:p>
-      <w:r>
-        <w:t xml:space="preserve">· id_papel - </w:t>
-      </w:r>
-      <w:r>
-        <w:rPr>
-          <w:b/>
-          <w:bCs/>
-        </w:rPr>
-        <w:t>(PK)</w:t>
-      </w:r>
-      <w:r>
-        <w:t xml:space="preserve"> Chave primária da entidade Papel. Identifica de forma única cada papel existente no sistema.</w:t>
-      </w:r>
-    </w:p>
-    <w:p/>
-    <w:p>
-      <w:r>
-        <w:rPr>
-          <w:b/>
-          <w:bCs/>
-        </w:rPr>
-        <w:t>Pessoa_Papel</w:t>
-      </w:r>
-    </w:p>
-    <w:p>
-      <w:r>
-        <w:rPr>
-          <w:b/>
-          <w:bCs/>
-        </w:rPr>
-        <w:t>Chave Primária</w:t>
-      </w:r>
-    </w:p>
-    <w:p>
-      <w:r>
-        <w:t xml:space="preserve">A entidade </w:t>
-      </w:r>
-      <w:r>
-        <w:rPr>
-          <w:b/>
-          <w:bCs/>
-        </w:rPr>
-        <w:t>Pessoa_Papel</w:t>
-      </w:r>
-      <w:r>
-        <w:t xml:space="preserve"> utiliza uma </w:t>
-      </w:r>
-      <w:r>
-        <w:rPr>
-          <w:b/>
-          <w:bCs/>
-        </w:rPr>
-        <w:t>chave primária composta</w:t>
-      </w:r>
-      <w:r>
-        <w:t>, formada pela combinação dos campos id_pessoa e id_papel.</w:t>
-      </w:r>
-    </w:p>
-    <w:p>
-      <w:r>
-        <w:t xml:space="preserve">· id_pessoa - </w:t>
-      </w:r>
-      <w:r>
-        <w:rPr>
-          <w:b/>
-          <w:bCs/>
-        </w:rPr>
-        <w:t>(PK, FK)</w:t>
-      </w:r>
-      <w:r>
-        <w:t xml:space="preserve"> Parte da chave primária composta e chave estrangeira que </w:t>
-      </w:r>
-      <w:r>
-        <w:t>referência</w:t>
-      </w:r>
-      <w:r>
-        <w:t xml:space="preserve"> a entidade </w:t>
-      </w:r>
-      <w:r>
-        <w:rPr>
-          <w:b/>
-          <w:bCs/>
-        </w:rPr>
-        <w:t>Pessoa</w:t>
-      </w:r>
-      <w:r>
-        <w:t>.</w:t>
-      </w:r>
-    </w:p>
-    <w:p>
-      <w:r>
-        <w:t xml:space="preserve">· id_papel - </w:t>
-      </w:r>
-      <w:r>
-        <w:rPr>
-          <w:b/>
-          <w:bCs/>
-        </w:rPr>
-        <w:t>(PK, FK)</w:t>
-      </w:r>
-      <w:r>
-        <w:t xml:space="preserve"> Parte da chave primária composta e chave estrangeira que </w:t>
-      </w:r>
-      <w:r>
-        <w:t>referência</w:t>
-      </w:r>
-      <w:r>
-        <w:t xml:space="preserve"> a entidade </w:t>
-      </w:r>
-      <w:r>
-        <w:rPr>
-          <w:b/>
-          <w:bCs/>
-        </w:rPr>
-        <w:t>Papel</w:t>
-      </w:r>
-      <w:r>
-        <w:t>.</w:t>
-      </w:r>
-    </w:p>
-    <w:p>
-      <w:pPr>
-        <w:rPr>
-          <w:b/>
-          <w:bCs/>
-        </w:rPr>
-      </w:pPr>
-      <w:r>
-        <w:rPr>
-          <w:b/>
-          <w:bCs/>
-        </w:rPr>
-        <w:t>Chaves Estrangeiras</w:t>
-      </w:r>
-    </w:p>
-    <w:p>
-      <w:r>
-        <w:t xml:space="preserve">· id_pessoa - </w:t>
-      </w:r>
-      <w:r>
-        <w:rPr>
-          <w:b/>
-          <w:bCs/>
-        </w:rPr>
-        <w:t>(FK)</w:t>
-      </w:r>
-      <w:r>
-        <w:t xml:space="preserve"> </w:t>
-      </w:r>
-      <w:r>
-        <w:t>Referência</w:t>
-      </w:r>
-      <w:r>
-        <w:t xml:space="preserve"> Pessoa.id_pessoa, identificando a pessoa à qual o papel foi atribuído.</w:t>
-      </w:r>
-    </w:p>
-    <w:p>
-      <w:r>
-        <w:t xml:space="preserve">· id_papel - </w:t>
-      </w:r>
-      <w:r>
-        <w:rPr>
-          <w:b/>
-          <w:bCs/>
-        </w:rPr>
-        <w:t>(FK)</w:t>
-      </w:r>
-      <w:r>
-        <w:t xml:space="preserve"> </w:t>
-      </w:r>
-      <w:r>
-        <w:t>Referência</w:t>
-      </w:r>
-      <w:r>
-        <w:t xml:space="preserve"> Papel.id_papel, identificando o papel atribuído à pessoa.</w:t>
-      </w:r>
-    </w:p>
-    <w:p/>
-    <w:p>
-      <w:r>
-        <w:rPr>
-          <w:b/>
-          <w:bCs/>
-        </w:rPr>
-        <w:t>Usuário Interno</w:t>
-      </w:r>
-    </w:p>
-    <w:p>
-      <w:r>
-        <w:rPr>
-          <w:b/>
-          <w:bCs/>
-        </w:rPr>
-        <w:t>Chave Primária</w:t>
-      </w:r>
-    </w:p>
-    <w:p>
-      <w:r>
-        <w:t xml:space="preserve">· id_usuario - </w:t>
-      </w:r>
-      <w:r>
-        <w:rPr>
-          <w:b/>
-          <w:bCs/>
-        </w:rPr>
-        <w:t>(PK)</w:t>
-      </w:r>
-      <w:r>
-        <w:t xml:space="preserve"> Chave primária da entidade Usuário Interno. Identifica de forma única cada conta de acesso ao painel interno do sistema.</w:t>
-      </w:r>
-    </w:p>
-    <w:p>
-      <w:pPr>
-        <w:rPr>
-          <w:b/>
-          <w:bCs/>
-        </w:rPr>
-      </w:pPr>
-      <w:r>
-        <w:rPr>
-          <w:b/>
-          <w:bCs/>
-        </w:rPr>
-        <w:t>Chave Estrangeira</w:t>
-      </w:r>
-    </w:p>
-    <w:p>
-      <w:r>
-        <w:t xml:space="preserve">· id_pessoa - </w:t>
-      </w:r>
-      <w:r>
-        <w:rPr>
-          <w:b/>
-          <w:bCs/>
-        </w:rPr>
-        <w:t>(FK)</w:t>
-      </w:r>
-      <w:r>
-        <w:t xml:space="preserve"> Chave estrangeira que </w:t>
-      </w:r>
-      <w:r>
-        <w:t>referência</w:t>
-      </w:r>
-      <w:r>
-        <w:t xml:space="preserve"> o campo id_pessoa da entidade </w:t>
-      </w:r>
-      <w:r>
-        <w:rPr>
-          <w:b/>
-          <w:bCs/>
-        </w:rPr>
-        <w:t>Pessoa</w:t>
-      </w:r>
-      <w:r>
-        <w:t>. Esse campo associa a conta de usuário interno ao cadastro único da pessoa correspondente.</w:t>
-      </w:r>
-    </w:p>
-    <w:p/>
-    <w:p>
-      <w:r>
-        <w:rPr>
-          <w:b/>
-          <w:bCs/>
-        </w:rPr>
-        <w:t>Responsável</w:t>
-      </w:r>
-    </w:p>
-    <w:p>
-      <w:r>
-        <w:rPr>
-          <w:b/>
-          <w:bCs/>
-        </w:rPr>
-        <w:t>Chave Primária</w:t>
-      </w:r>
-    </w:p>
-    <w:p>
-      <w:r>
-        <w:lastRenderedPageBreak/>
-        <w:t xml:space="preserve">· id_responsavel - </w:t>
-      </w:r>
-      <w:r>
-        <w:rPr>
-          <w:b/>
-          <w:bCs/>
-        </w:rPr>
-        <w:t>(PK)</w:t>
-      </w:r>
-      <w:r>
-        <w:t xml:space="preserve"> Chave primária da entidade Responsável. Identifica de forma única cada registro de responsável armazenado no banco de dados.</w:t>
-      </w:r>
-    </w:p>
-    <w:p>
-      <w:pPr>
-        <w:rPr>
-          <w:b/>
-          <w:bCs/>
-        </w:rPr>
-      </w:pPr>
-      <w:r>
-        <w:rPr>
-          <w:b/>
-          <w:bCs/>
-        </w:rPr>
-        <w:t>Chave Estrangeira</w:t>
-      </w:r>
-    </w:p>
-    <w:p>
-      <w:r>
-        <w:t xml:space="preserve">· id_pessoa - </w:t>
-      </w:r>
-      <w:r>
-        <w:rPr>
-          <w:b/>
-          <w:bCs/>
-        </w:rPr>
-        <w:t>(FK)</w:t>
-      </w:r>
-      <w:r>
-        <w:t xml:space="preserve"> Chave estrangeira que </w:t>
-      </w:r>
-      <w:r>
-        <w:t>referência</w:t>
-      </w:r>
-      <w:r>
-        <w:t xml:space="preserve"> o campo id_pessoa da entidade </w:t>
-      </w:r>
-      <w:r>
-        <w:rPr>
-          <w:b/>
-          <w:bCs/>
-        </w:rPr>
-        <w:t>Pessoa</w:t>
-      </w:r>
-      <w:r>
-        <w:t>. Esse campo associa o registro de responsável ao cadastro único da pessoa correspondente.</w:t>
-      </w:r>
-    </w:p>
-    <w:p/>
-    <w:p>
-      <w:r>
-        <w:rPr>
-          <w:b/>
-          <w:bCs/>
-        </w:rPr>
-        <w:t>Evento</w:t>
-      </w:r>
-    </w:p>
-    <w:p>
-      <w:r>
-        <w:rPr>
-          <w:b/>
-          <w:bCs/>
-        </w:rPr>
-        <w:t>Chave Primária</w:t>
-      </w:r>
-    </w:p>
-    <w:p>
-      <w:r>
-        <w:t xml:space="preserve">· id_evento - </w:t>
-      </w:r>
-      <w:r>
-        <w:rPr>
-          <w:b/>
-          <w:bCs/>
-        </w:rPr>
-        <w:t>(PK)</w:t>
-      </w:r>
-      <w:r>
-        <w:t xml:space="preserve"> Chave primária da entidade Evento. Identifica de forma única cada evento cadastrado no banco de dados.</w:t>
-      </w:r>
-    </w:p>
-    <w:p/>
-    <w:p>
-      <w:r>
-        <w:rPr>
-          <w:b/>
-          <w:bCs/>
-        </w:rPr>
-        <w:t>Evento_Responsavel</w:t>
-      </w:r>
-    </w:p>
-    <w:p>
-      <w:r>
-        <w:rPr>
-          <w:b/>
-          <w:bCs/>
-        </w:rPr>
-        <w:t>Chave Primária</w:t>
-      </w:r>
-    </w:p>
-    <w:p>
-      <w:r>
-        <w:t xml:space="preserve">A entidade </w:t>
-      </w:r>
-      <w:r>
-        <w:rPr>
-          <w:b/>
-          <w:bCs/>
-        </w:rPr>
-        <w:t>Evento_Responsavel</w:t>
-      </w:r>
-      <w:r>
-        <w:t xml:space="preserve"> utiliza uma </w:t>
-      </w:r>
-      <w:r>
-        <w:rPr>
-          <w:b/>
-          <w:bCs/>
-        </w:rPr>
-        <w:t>chave primária composta</w:t>
-      </w:r>
-      <w:r>
-        <w:t>, formada pela combinação dos campos id_evento e id_responsavel.</w:t>
-      </w:r>
-    </w:p>
-    <w:p>
-      <w:r>
-        <w:t xml:space="preserve">· id_evento - </w:t>
-      </w:r>
-      <w:r>
-        <w:rPr>
-          <w:b/>
-          <w:bCs/>
-        </w:rPr>
-        <w:t>(PK, FK)</w:t>
-      </w:r>
-      <w:r>
-        <w:t xml:space="preserve"> Parte da chave primária composta e chave estrangeira que </w:t>
-      </w:r>
-      <w:r>
-        <w:t>referência</w:t>
-      </w:r>
-      <w:r>
-        <w:t xml:space="preserve"> a entidade </w:t>
-      </w:r>
-      <w:r>
-        <w:rPr>
-          <w:b/>
-          <w:bCs/>
-        </w:rPr>
-        <w:t>Evento</w:t>
-      </w:r>
-      <w:r>
-        <w:t>.</w:t>
-      </w:r>
-    </w:p>
-    <w:p>
-      <w:r>
-        <w:t xml:space="preserve">· id_responsavel - </w:t>
-      </w:r>
-      <w:r>
-        <w:rPr>
-          <w:b/>
-          <w:bCs/>
-        </w:rPr>
-        <w:t>(PK, FK)</w:t>
-      </w:r>
-      <w:r>
-        <w:t xml:space="preserve"> Parte da chave primária composta e chave estrangeira que </w:t>
-      </w:r>
-      <w:r>
-        <w:t>referência</w:t>
-      </w:r>
-      <w:r>
-        <w:t xml:space="preserve"> a entidade </w:t>
-      </w:r>
-      <w:r>
-        <w:rPr>
-          <w:b/>
-          <w:bCs/>
-        </w:rPr>
-        <w:t>Responsável</w:t>
-      </w:r>
-      <w:r>
-        <w:t>.</w:t>
-      </w:r>
-    </w:p>
-    <w:p/>
-    <w:p>
-      <w:pPr>
-        <w:rPr>
-          <w:b/>
-          <w:bCs/>
-        </w:rPr>
-      </w:pPr>
-      <w:r>
-        <w:rPr>
-          <w:b/>
-          <w:bCs/>
-        </w:rPr>
-        <w:t>Chaves Estrangeiras</w:t>
-      </w:r>
-    </w:p>
-    <w:p>
-      <w:r>
-        <w:t xml:space="preserve">· id_evento - </w:t>
-      </w:r>
-      <w:r>
-        <w:rPr>
-          <w:b/>
-          <w:bCs/>
-        </w:rPr>
-        <w:t>(FK)</w:t>
-      </w:r>
-      <w:r>
-        <w:t xml:space="preserve"> </w:t>
-      </w:r>
-      <w:r>
-        <w:t>Referência</w:t>
-      </w:r>
-      <w:r>
-        <w:t xml:space="preserve"> Evento.id_evento, identificando o evento ao qual o responsável está vinculado.</w:t>
-      </w:r>
-    </w:p>
-    <w:p>
-      <w:r>
-        <w:t xml:space="preserve">· id_responsavel - </w:t>
-      </w:r>
-      <w:r>
-        <w:rPr>
-          <w:b/>
-          <w:bCs/>
-        </w:rPr>
-        <w:t>(FK)</w:t>
-      </w:r>
-      <w:r>
-        <w:t xml:space="preserve"> </w:t>
-      </w:r>
-      <w:r>
-        <w:t>Referência</w:t>
-      </w:r>
-      <w:r>
-        <w:t xml:space="preserve"> Responsavel.id_responsavel, identificando o responsável associado ao evento.</w:t>
-      </w:r>
-    </w:p>
-    <w:p/>
-    <w:p>
-      <w:r>
-        <w:rPr>
-          <w:b/>
-          <w:bCs/>
-        </w:rPr>
-        <w:t>Ocorrência</w:t>
-      </w:r>
-    </w:p>
-    <w:p>
-      <w:r>
-        <w:rPr>
-          <w:b/>
-          <w:bCs/>
-        </w:rPr>
-        <w:t>Chave Primária</w:t>
-      </w:r>
-    </w:p>
-    <w:p>
-      <w:r>
-        <w:t xml:space="preserve">· id_ocorrencia - </w:t>
-      </w:r>
-      <w:r>
-        <w:rPr>
-          <w:b/>
-          <w:bCs/>
-        </w:rPr>
-        <w:t>(PK)</w:t>
-      </w:r>
-      <w:r>
-        <w:t xml:space="preserve"> Chave primária da entidade Ocorrência. Identifica de forma única cada realização concreta de um evento no banco de dados.</w:t>
-      </w:r>
-    </w:p>
-    <w:p>
-      <w:pPr>
-        <w:rPr>
-          <w:b/>
-          <w:bCs/>
-        </w:rPr>
-      </w:pPr>
-      <w:r>
-        <w:rPr>
-          <w:b/>
-          <w:bCs/>
-        </w:rPr>
-        <w:lastRenderedPageBreak/>
-        <w:t>Chave Estrangeira</w:t>
-      </w:r>
-    </w:p>
-    <w:p>
-      <w:r>
-        <w:t xml:space="preserve">· id_evento - </w:t>
-      </w:r>
-      <w:r>
-        <w:rPr>
-          <w:b/>
-          <w:bCs/>
-        </w:rPr>
-        <w:t>(FK)</w:t>
-      </w:r>
-      <w:r>
-        <w:t xml:space="preserve"> Chave estrangeira que </w:t>
-      </w:r>
-      <w:r>
-        <w:t>referência</w:t>
-      </w:r>
-      <w:r>
-        <w:t xml:space="preserve"> o campo id_evento da entidade </w:t>
-      </w:r>
-      <w:r>
-        <w:rPr>
-          <w:b/>
-          <w:bCs/>
-        </w:rPr>
-        <w:t>Evento</w:t>
-      </w:r>
-      <w:r>
-        <w:t>. Esse campo identifica a qual evento a ocorrência pertence.</w:t>
-      </w:r>
-    </w:p>
-    <w:p/>
-    <w:p>
-      <w:r>
-        <w:rPr>
-          <w:b/>
-          <w:bCs/>
-        </w:rPr>
-        <w:t>Inscrição</w:t>
-      </w:r>
-    </w:p>
-    <w:p>
-      <w:r>
-        <w:t xml:space="preserve">Para a entidade </w:t>
-      </w:r>
-      <w:r>
-        <w:rPr>
-          <w:b/>
-          <w:bCs/>
-        </w:rPr>
-        <w:t>Inscrição</w:t>
-      </w:r>
-      <w:r>
-        <w:t>, a definição das chaves pode ser documentada da seguinte forma:</w:t>
-      </w:r>
-    </w:p>
-    <w:p>
-      <w:pPr>
-        <w:rPr>
-          <w:b/>
-          <w:bCs/>
-        </w:rPr>
-      </w:pPr>
-      <w:r>
-        <w:rPr>
-          <w:b/>
-          <w:bCs/>
-        </w:rPr>
-        <w:t>Inscrição</w:t>
-      </w:r>
-    </w:p>
-    <w:p>
-      <w:r>
-        <w:rPr>
-          <w:b/>
-          <w:bCs/>
-        </w:rPr>
-        <w:t>Chave Primária</w:t>
-      </w:r>
-    </w:p>
-    <w:p>
-      <w:r>
-        <w:t xml:space="preserve">· id_inscricao - </w:t>
-      </w:r>
-      <w:r>
-        <w:rPr>
-          <w:b/>
-          <w:bCs/>
-        </w:rPr>
-        <w:t>(PK)</w:t>
-      </w:r>
-      <w:r>
-        <w:t xml:space="preserve"> Chave primária da entidade Inscrição. Identifica de forma única cada registro de inscrição armazenado no banco de dados.</w:t>
-      </w:r>
-    </w:p>
-    <w:p>
-      <w:pPr>
-        <w:rPr>
-          <w:b/>
-          <w:bCs/>
-        </w:rPr>
-      </w:pPr>
-      <w:r>
-        <w:rPr>
-          <w:b/>
-          <w:bCs/>
-        </w:rPr>
-        <w:t>Chaves Estrangeiras</w:t>
-      </w:r>
-    </w:p>
-    <w:p>
-      <w:r>
-        <w:t xml:space="preserve">· id_pessoa - </w:t>
-      </w:r>
-      <w:r>
-        <w:rPr>
-          <w:b/>
-          <w:bCs/>
-        </w:rPr>
-        <w:t>(FK)</w:t>
-      </w:r>
-      <w:r>
-        <w:t xml:space="preserve"> Chave estrangeira que </w:t>
-      </w:r>
-      <w:r>
-        <w:t>referência</w:t>
-      </w:r>
-      <w:r>
-        <w:t xml:space="preserve"> o campo id_pessoa da entidade </w:t>
-      </w:r>
-      <w:r>
-        <w:rPr>
-          <w:b/>
-          <w:bCs/>
-        </w:rPr>
-        <w:t>Pessoa</w:t>
-      </w:r>
-      <w:r>
-        <w:t>. Esse campo identifica a pessoa que realizou a inscrição.</w:t>
-      </w:r>
-    </w:p>
-    <w:p>
-      <w:r>
-        <w:t xml:space="preserve">· id_evento - </w:t>
-      </w:r>
-      <w:r>
-        <w:rPr>
-          <w:b/>
-          <w:bCs/>
-        </w:rPr>
-        <w:t>(FK)</w:t>
-      </w:r>
-      <w:r>
-        <w:t xml:space="preserve"> Chave estrangeira que </w:t>
-      </w:r>
-      <w:r>
-        <w:t>referência</w:t>
-      </w:r>
-      <w:r>
-        <w:t xml:space="preserve"> o campo id_evento da entidade </w:t>
-      </w:r>
-      <w:r>
-        <w:rPr>
-          <w:b/>
-          <w:bCs/>
-        </w:rPr>
-        <w:t>Evento</w:t>
-      </w:r>
-      <w:r>
-        <w:t>. Esse campo identifica o evento no qual a pessoa está inscrita.</w:t>
-      </w:r>
-    </w:p>
-    <w:p/>
-    <w:p>
-      <w:r>
-        <w:rPr>
-          <w:b/>
-          <w:bCs/>
-        </w:rPr>
-        <w:t>Presença</w:t>
-      </w:r>
-    </w:p>
-    <w:p>
-      <w:r>
-        <w:rPr>
-          <w:b/>
-          <w:bCs/>
-        </w:rPr>
-        <w:t>Chave Primária</w:t>
-      </w:r>
-    </w:p>
-    <w:p>
-      <w:r>
-        <w:t xml:space="preserve">· id_presenca - </w:t>
-      </w:r>
-      <w:r>
-        <w:rPr>
-          <w:b/>
-          <w:bCs/>
-        </w:rPr>
-        <w:t>(PK)</w:t>
-      </w:r>
-      <w:r>
-        <w:t xml:space="preserve"> Chave primária da entidade Presença. Identifica de forma única cada registro de presença armazenado no banco de dados.</w:t>
-      </w:r>
-    </w:p>
-    <w:p>
-      <w:pPr>
-        <w:rPr>
-          <w:b/>
-          <w:bCs/>
-        </w:rPr>
-      </w:pPr>
-      <w:r>
-        <w:rPr>
-          <w:b/>
-          <w:bCs/>
-        </w:rPr>
-        <w:t>Chaves Estrangeiras</w:t>
-      </w:r>
-    </w:p>
-    <w:p>
-      <w:r>
-        <w:t xml:space="preserve">· id_inscricao - </w:t>
-      </w:r>
-      <w:r>
-        <w:rPr>
-          <w:b/>
-          <w:bCs/>
-        </w:rPr>
-        <w:t>(FK)</w:t>
-      </w:r>
-      <w:r>
-        <w:t xml:space="preserve"> Chave estrangeira que </w:t>
-      </w:r>
-      <w:r>
-        <w:t>referência</w:t>
-      </w:r>
-      <w:r>
-        <w:t xml:space="preserve"> o campo id_inscricao da entidade </w:t>
-      </w:r>
-      <w:r>
-        <w:rPr>
-          <w:b/>
-          <w:bCs/>
-        </w:rPr>
-        <w:t>Inscrição</w:t>
-      </w:r>
-      <w:r>
-        <w:t>. Esse campo identifica a inscrição à qual o registro de presença pertence.</w:t>
-      </w:r>
-    </w:p>
-    <w:p>
-      <w:r>
-        <w:t xml:space="preserve">· id_ocorrencia - </w:t>
-      </w:r>
-      <w:r>
-        <w:rPr>
-          <w:b/>
-          <w:bCs/>
-        </w:rPr>
-        <w:t>(FK)</w:t>
-      </w:r>
-      <w:r>
-        <w:t xml:space="preserve"> Chave estrangeira que </w:t>
-      </w:r>
-      <w:r>
-        <w:t>referência</w:t>
-      </w:r>
-      <w:r>
-        <w:t xml:space="preserve"> o campo id_ocorrencia da entidade </w:t>
-      </w:r>
-      <w:r>
-        <w:rPr>
-          <w:b/>
-          <w:bCs/>
-        </w:rPr>
-        <w:t>Ocorrência</w:t>
-      </w:r>
-      <w:r>
-        <w:t>. Esse campo identifica a ocorrência do evento na qual a presença ou falta foi registrada.</w:t>
-      </w:r>
-    </w:p>
-    <w:p/>
-    <w:p>
-      <w:pPr>
-        <w:pStyle w:val="Subttulo"/>
-      </w:pPr>
-      <w:r>
-        <w:t>Diagrama entidade relacionamento</w:t>
-      </w:r>
-    </w:p>
-    <w:p/>
-    <w:p>
-      <w:pPr>
-        <w:pStyle w:val="Subttulo"/>
-      </w:pPr>
-      <w:r>
-        <w:lastRenderedPageBreak/>
         <w:t xml:space="preserve">Modelo entidade relacionamento </w:t>
       </w:r>
     </w:p>

</xml_diff>